<commit_message>
manuscript work and 6 analysis
</commit_message>
<xml_diff>
--- a/Manuscript/Sections/Results Draft v1.0.docx
+++ b/Manuscript/Sections/Results Draft v1.0.docx
@@ -1091,6 +1091,323 @@
         <w:t>Cell Type Annotation</w:t>
       </w:r>
     </w:p>
+    <w:p>
+      <w:r>
+        <w:t>…</w:t>
+      </w:r>
+    </w:p>
+    <w:p>
+      <w:pPr>
+        <w:rPr>
+          <w:b/>
+          <w:bCs/>
+        </w:rPr>
+      </w:pPr>
+      <w:r>
+        <w:rPr>
+          <w:b/>
+          <w:bCs/>
+        </w:rPr>
+        <w:t xml:space="preserve">Changes in </w:t>
+      </w:r>
+      <w:r>
+        <w:rPr>
+          <w:b/>
+          <w:bCs/>
+        </w:rPr>
+        <w:t xml:space="preserve">Cell </w:t>
+      </w:r>
+      <w:r>
+        <w:rPr>
+          <w:b/>
+          <w:bCs/>
+        </w:rPr>
+        <w:t>T</w:t>
+      </w:r>
+      <w:r>
+        <w:rPr>
+          <w:b/>
+          <w:bCs/>
+        </w:rPr>
+        <w:t xml:space="preserve">ype </w:t>
+      </w:r>
+      <w:r>
+        <w:rPr>
+          <w:b/>
+          <w:bCs/>
+        </w:rPr>
+        <w:t>C</w:t>
+      </w:r>
+      <w:r>
+        <w:rPr>
+          <w:b/>
+          <w:bCs/>
+        </w:rPr>
+        <w:t>omposition</w:t>
+      </w:r>
+      <w:r>
+        <w:rPr>
+          <w:b/>
+          <w:bCs/>
+        </w:rPr>
+        <w:t xml:space="preserve"> During Sex Change</w:t>
+      </w:r>
+    </w:p>
+    <w:p>
+      <w:r>
+        <w:rPr>
+          <w:b/>
+          <w:bCs/>
+        </w:rPr>
+        <w:tab/>
+      </w:r>
+      <w:r>
+        <w:t>Because sex change is associated with significant increases in brain size and composition, we next analyzed changes in cell type composition. We</w:t>
+      </w:r>
+      <w:r>
+        <w:t xml:space="preserve"> detected significant phase differences in the proportions of cells in 12 of the 27 (44.44%) clusters (</w:t>
+      </w:r>
+      <w:r>
+        <w:rPr>
+          <w:highlight w:val="yellow"/>
+        </w:rPr>
+        <w:t>Fig</w:t>
+      </w:r>
+      <w:r>
+        <w:t xml:space="preserve"> 2b, </w:t>
+      </w:r>
+      <w:r>
+        <w:rPr>
+          <w:highlight w:val="yellow"/>
+        </w:rPr>
+        <w:t>supplementary Fig x</w:t>
+      </w:r>
+      <w:r>
+        <w:t xml:space="preserve">). Of these, nine were decreases in cell population while only 3 were increases </w:t>
+      </w:r>
+      <w:r>
+        <w:rPr>
+          <w:highlight w:val="yellow"/>
+        </w:rPr>
+        <w:t>(see supplementary x for full table)</w:t>
+      </w:r>
+      <w:r>
+        <w:t xml:space="preserve">. Of note, </w:t>
+      </w:r>
+      <w:commentRangeStart w:id="7"/>
+      <w:r>
+        <w:t>oligodendrocytes</w:t>
+      </w:r>
+      <w:r>
+        <w:t xml:space="preserve"> </w:t>
+      </w:r>
+      <w:commentRangeEnd w:id="7"/>
+      <w:r>
+        <w:rPr>
+          <w:rStyle w:val="CommentReference"/>
+        </w:rPr>
+        <w:commentReference w:id="7"/>
+      </w:r>
+      <w:r>
+        <w:t>increased in population progressively with each phase of sex change and microglia increased</w:t>
+      </w:r>
+      <w:r>
+        <w:t xml:space="preserve"> in population early in sex change</w:t>
+      </w:r>
+      <w:r>
+        <w:t xml:space="preserve"> during the male-intermediate transition. </w:t>
+      </w:r>
+      <w:r>
+        <w:t xml:space="preserve">Consistent with the idea that sex change is characterized by increases in neuro and </w:t>
+      </w:r>
+      <w:proofErr w:type="spellStart"/>
+      <w:r>
+        <w:t>gliogenesis</w:t>
+      </w:r>
+      <w:proofErr w:type="spellEnd"/>
+      <w:r>
+        <w:t xml:space="preserve"> (</w:t>
+      </w:r>
+      <w:r>
+        <w:rPr>
+          <w:highlight w:val="yellow"/>
+        </w:rPr>
+        <w:t>CITATION</w:t>
+      </w:r>
+      <w:r>
+        <w:t xml:space="preserve">), radial glia transiently increased in population in intermediates before returning to male-like levels in females. </w:t>
+      </w:r>
+    </w:p>
+    <w:p>
+      <w:r>
+        <w:tab/>
+        <w:t>Because large scale changes in glial populations may obscure more subtle changes in neuronal population</w:t>
+      </w:r>
+      <w:r>
+        <w:t xml:space="preserve">, </w:t>
+      </w:r>
+      <w:r>
+        <w:t>we next analyzed changes in proportion only considering neuronal cell types. Of the 20 neuronal clusters we analyzed, 11 (55%) changed in population, with four decreasing and seven increasing</w:t>
+      </w:r>
+      <w:r>
+        <w:t xml:space="preserve"> in population </w:t>
+      </w:r>
+      <w:r>
+        <w:t>(</w:t>
+      </w:r>
+      <w:r>
+        <w:rPr>
+          <w:highlight w:val="yellow"/>
+        </w:rPr>
+        <w:t>Fig</w:t>
+      </w:r>
+      <w:r>
+        <w:t xml:space="preserve"> 2</w:t>
+      </w:r>
+      <w:r>
+        <w:t>c</w:t>
+      </w:r>
+      <w:r>
+        <w:t xml:space="preserve">, </w:t>
+      </w:r>
+      <w:r>
+        <w:rPr>
+          <w:highlight w:val="yellow"/>
+        </w:rPr>
+        <w:t>supplementary Fig x</w:t>
+      </w:r>
+      <w:r>
+        <w:t>). Of these, several clusters mapping to the POA changed in population.</w:t>
+      </w:r>
+      <w:r>
+        <w:t xml:space="preserve"> </w:t>
+      </w:r>
+      <w:r>
+        <w:t>In the male-intermediate transition, we found significant increases in clusters 14 (</w:t>
+      </w:r>
+      <w:r>
+        <w:rPr>
+          <w:highlight w:val="yellow"/>
+        </w:rPr>
+        <w:t>LABEL</w:t>
+      </w:r>
+      <w:r>
+        <w:t xml:space="preserve"> Gaba</w:t>
+      </w:r>
+      <w:r>
+        <w:t>), 17 (</w:t>
+      </w:r>
+      <w:r>
+        <w:rPr>
+          <w:highlight w:val="yellow"/>
+        </w:rPr>
+        <w:t>LABEL</w:t>
+      </w:r>
+      <w:r>
+        <w:t xml:space="preserve"> Glut</w:t>
+      </w:r>
+      <w:r>
+        <w:t>), and 18</w:t>
+      </w:r>
+      <w:r>
+        <w:t xml:space="preserve"> Glut</w:t>
+      </w:r>
+      <w:r>
+        <w:t>). In intermediates, we found a transient increase in the population of cluster 0 (</w:t>
+      </w:r>
+      <w:r>
+        <w:rPr>
+          <w:highlight w:val="yellow"/>
+        </w:rPr>
+        <w:t>LABEL</w:t>
+      </w:r>
+      <w:r>
+        <w:t xml:space="preserve"> Mixed (which type?)</w:t>
+      </w:r>
+      <w:r>
+        <w:t>), and a transient decrease in cluster 4 (</w:t>
+      </w:r>
+      <w:r>
+        <w:rPr>
+          <w:highlight w:val="yellow"/>
+        </w:rPr>
+        <w:t>LABEL</w:t>
+      </w:r>
+      <w:r>
+        <w:t xml:space="preserve"> Glut</w:t>
+      </w:r>
+      <w:r>
+        <w:t>). Interestingly, we found a significant increase in intermediate-female transition in clusters 6 (</w:t>
+      </w:r>
+      <w:r>
+        <w:rPr>
+          <w:highlight w:val="yellow"/>
+        </w:rPr>
+        <w:t>LABEL</w:t>
+      </w:r>
+      <w:r>
+        <w:t xml:space="preserve"> mixed (which type?)</w:t>
+      </w:r>
+      <w:r>
+        <w:t>) and 19 (</w:t>
+      </w:r>
+      <w:r>
+        <w:rPr>
+          <w:highlight w:val="yellow"/>
+        </w:rPr>
+        <w:t>LABEL</w:t>
+      </w:r>
+      <w:r>
+        <w:t xml:space="preserve"> Gaba</w:t>
+      </w:r>
+      <w:r>
+        <w:t>), and decreases in 9 (</w:t>
+      </w:r>
+      <w:r>
+        <w:rPr>
+          <w:highlight w:val="yellow"/>
+        </w:rPr>
+        <w:t>LABEL</w:t>
+      </w:r>
+      <w:r>
+        <w:t xml:space="preserve"> Mixed</w:t>
+      </w:r>
+      <w:r>
+        <w:t>), 22 (</w:t>
+      </w:r>
+      <w:r>
+        <w:rPr>
+          <w:highlight w:val="yellow"/>
+        </w:rPr>
+        <w:t>LABEL</w:t>
+      </w:r>
+      <w:r>
+        <w:t xml:space="preserve"> </w:t>
+      </w:r>
+      <w:proofErr w:type="spellStart"/>
+      <w:r>
+        <w:t>GLut</w:t>
+      </w:r>
+      <w:proofErr w:type="spellEnd"/>
+      <w:r>
+        <w:t>), and 24 (</w:t>
+      </w:r>
+      <w:r>
+        <w:rPr>
+          <w:highlight w:val="yellow"/>
+        </w:rPr>
+        <w:t>LABEL</w:t>
+      </w:r>
+      <w:r>
+        <w:t xml:space="preserve"> Mixed</w:t>
+      </w:r>
+      <w:r>
+        <w:t xml:space="preserve">). </w:t>
+      </w:r>
+      <w:r>
+        <w:t xml:space="preserve">Taken together, these data suggest that the neurogenesis that occurs during sex change populates different neuronal populations at different points along the transition, </w:t>
+      </w:r>
+    </w:p>
     <w:p/>
     <w:p>
       <w:pPr>
@@ -1099,55 +1416,19 @@
           <w:bCs/>
         </w:rPr>
       </w:pPr>
-      <w:commentRangeStart w:id="7"/>
-      <w:r>
-        <w:rPr>
-          <w:b/>
-          <w:bCs/>
-        </w:rPr>
-        <w:t xml:space="preserve">Changes in </w:t>
-      </w:r>
-      <w:r>
-        <w:rPr>
-          <w:b/>
-          <w:bCs/>
-        </w:rPr>
-        <w:t xml:space="preserve">Cell </w:t>
-      </w:r>
-      <w:r>
-        <w:rPr>
-          <w:b/>
-          <w:bCs/>
-        </w:rPr>
-        <w:t>T</w:t>
-      </w:r>
-      <w:r>
-        <w:rPr>
-          <w:b/>
-          <w:bCs/>
-        </w:rPr>
-        <w:t xml:space="preserve">ype </w:t>
-      </w:r>
-      <w:r>
-        <w:rPr>
-          <w:b/>
-          <w:bCs/>
-        </w:rPr>
-        <w:t>C</w:t>
-      </w:r>
-      <w:r>
-        <w:rPr>
-          <w:b/>
-          <w:bCs/>
-        </w:rPr>
-        <w:t>omposition</w:t>
-      </w:r>
-      <w:r>
-        <w:rPr>
-          <w:b/>
-          <w:bCs/>
-        </w:rPr>
-        <w:t xml:space="preserve"> Occur During Sex Change</w:t>
+      <w:r>
+        <w:rPr>
+          <w:b/>
+          <w:bCs/>
+        </w:rPr>
+        <w:t xml:space="preserve">Distinct </w:t>
+      </w:r>
+      <w:r>
+        <w:rPr>
+          <w:b/>
+          <w:bCs/>
+        </w:rPr>
+        <w:t>Transcriptomic Changes Associated with Sex Change</w:t>
       </w:r>
     </w:p>
     <w:p>
@@ -1159,139 +1440,480 @@
         <w:tab/>
       </w:r>
       <w:r>
-        <w:t>We detected significant phase differences in the proportions of cells in 12 of the 27 (44.44%) clusters (</w:t>
+        <w:t xml:space="preserve">To characterize the transcriptomic changes associated with sex change in the POA, we next </w:t>
+      </w:r>
+      <w:r>
+        <w:t>analy</w:t>
+      </w:r>
+      <w:r>
+        <w:t>zed differentially expressed genes</w:t>
+      </w:r>
+      <w:r>
+        <w:t xml:space="preserve"> by phase</w:t>
+      </w:r>
+      <w:r>
+        <w:t xml:space="preserve"> (DEGs). Genes that significantly differed </w:t>
+      </w:r>
+      <w:r>
+        <w:t xml:space="preserve">between phases </w:t>
+      </w:r>
+      <w:r>
+        <w:t xml:space="preserve">were then further classified by their pairwise pattern across the three major </w:t>
+      </w:r>
+      <w:r>
+        <w:lastRenderedPageBreak/>
+        <w:t>groups (</w:t>
       </w:r>
       <w:r>
         <w:rPr>
           <w:highlight w:val="yellow"/>
         </w:rPr>
+        <w:t>see supplementary methods…</w:t>
+      </w:r>
+      <w:r>
+        <w:t xml:space="preserve">). </w:t>
+      </w:r>
+      <w:r>
+        <w:t xml:space="preserve">Of the 290 DEGs, 153 significantly differed between males and intermediates, 214 differed between females and intermediates, and 234 differed between females and males. </w:t>
+      </w:r>
+      <w:r>
+        <w:t xml:space="preserve">In total, we detected 290 </w:t>
+      </w:r>
+      <w:r>
+        <w:t>DEG</w:t>
+      </w:r>
+      <w:r>
+        <w:t xml:space="preserve">s, of which 140 were </w:t>
+      </w:r>
+      <w:r>
+        <w:t>downregulated</w:t>
+      </w:r>
+      <w:r>
+        <w:t xml:space="preserve"> and</w:t>
+      </w:r>
+      <w:r>
+        <w:t xml:space="preserve"> 150 were upregulated. We found DEGs were biased in clusters 6 (</w:t>
+      </w:r>
+      <w:r>
+        <w:rPr>
+          <w:highlight w:val="yellow"/>
+        </w:rPr>
+        <w:t>LABEL</w:t>
+      </w:r>
+      <w:r>
+        <w:t>), 1 (Radial Glia), 0 (</w:t>
+      </w:r>
+      <w:r>
+        <w:rPr>
+          <w:highlight w:val="yellow"/>
+        </w:rPr>
+        <w:t>LABEL</w:t>
+      </w:r>
+      <w:r>
+        <w:t>), and 11 (Microglia) (</w:t>
+      </w:r>
+      <w:r>
+        <w:rPr>
+          <w:highlight w:val="yellow"/>
+        </w:rPr>
         <w:t>Figure</w:t>
       </w:r>
       <w:r>
         <w:t>)</w:t>
       </w:r>
       <w:r>
-        <w:t xml:space="preserve">. Of these, nine were decreases in cell population while only 3 were increases </w:t>
+        <w:t xml:space="preserve"> </w:t>
+      </w:r>
+    </w:p>
+    <w:p>
+      <w:r>
+        <w:tab/>
+        <w:t>In these clusters, we detected strong evidence for specific changes in cell function. Gene ontology (</w:t>
+      </w:r>
+      <w:commentRangeStart w:id="8"/>
+      <w:commentRangeStart w:id="9"/>
+      <w:r>
+        <w:t>GO</w:t>
+      </w:r>
+      <w:commentRangeEnd w:id="8"/>
+      <w:r>
+        <w:rPr>
+          <w:rStyle w:val="CommentReference"/>
+        </w:rPr>
+        <w:commentReference w:id="8"/>
+      </w:r>
+      <w:commentRangeEnd w:id="9"/>
+      <w:r>
+        <w:rPr>
+          <w:rStyle w:val="CommentReference"/>
+        </w:rPr>
+        <w:commentReference w:id="9"/>
+      </w:r>
+      <w:r>
+        <w:t>) analysis of the DEGs in 6_POA_2 found several terms related to intracellular signaling cascades, transcription, and the perineuronal net (</w:t>
       </w:r>
       <w:r>
         <w:rPr>
           <w:highlight w:val="yellow"/>
         </w:rPr>
-        <w:t>(see supplementary x for full table)</w:t>
-      </w:r>
-      <w:r>
-        <w:t xml:space="preserve">. </w:t>
-      </w:r>
-      <w:r>
-        <w:t>Of note,</w:t>
-      </w:r>
-      <w:r>
-        <w:t xml:space="preserve"> oligodendrocytes increased in population </w:t>
-      </w:r>
-      <w:r>
-        <w:t xml:space="preserve">progressively </w:t>
-      </w:r>
-      <w:r>
-        <w:t>with each phase</w:t>
-      </w:r>
-      <w:r>
-        <w:t xml:space="preserve"> of sex change and</w:t>
-      </w:r>
-      <w:r>
-        <w:t xml:space="preserve"> microglia increased in </w:t>
-      </w:r>
-      <w:r>
-        <w:t>during the male-intermediate transition</w:t>
+        <w:t>Figure and supplementary figure</w:t>
+      </w:r>
+      <w:r>
+        <w:t>).</w:t>
+      </w:r>
+    </w:p>
+    <w:p/>
+    <w:p>
+      <w:pPr>
+        <w:rPr>
+          <w:b/>
+          <w:bCs/>
+        </w:rPr>
+      </w:pPr>
+      <w:r>
+        <w:rPr>
+          <w:b/>
+          <w:bCs/>
+        </w:rPr>
+        <w:t>Cluster 6] Undergoes Synaptic and Extracellular Matrix Remodeling in Intermediates</w:t>
+      </w:r>
+    </w:p>
+    <w:p>
+      <w:pPr>
+        <w:ind w:firstLine="720"/>
+      </w:pPr>
+      <w:commentRangeStart w:id="10"/>
+      <w:commentRangeStart w:id="11"/>
+      <w:r>
+        <w:t xml:space="preserve">Our DEG analysis of [cluster6] revealed several changes in genes associated with the extracellular matrix, cell-cell adhesion, and the synapse. </w:t>
+      </w:r>
+    </w:p>
+    <w:p>
+      <w:pPr>
+        <w:ind w:firstLine="720"/>
+      </w:pPr>
+      <w:r>
+        <w:t xml:space="preserve">In intermediates, </w:t>
+      </w:r>
+      <w:r>
+        <w:rPr>
+          <w:i/>
+          <w:iCs/>
+        </w:rPr>
+        <w:t>nxph1</w:t>
+      </w:r>
+      <w:r>
+        <w:t xml:space="preserve">, </w:t>
+      </w:r>
+      <w:r>
+        <w:rPr>
+          <w:i/>
+          <w:iCs/>
+        </w:rPr>
+        <w:t>cntn4</w:t>
+      </w:r>
+      <w:r>
+        <w:t>,</w:t>
+      </w:r>
+      <w:r>
+        <w:t xml:space="preserve"> </w:t>
+      </w:r>
+      <w:r>
+        <w:rPr>
+          <w:i/>
+          <w:iCs/>
+        </w:rPr>
+        <w:t>cntnap4</w:t>
+      </w:r>
+      <w:r>
+        <w:t xml:space="preserve">, and </w:t>
+      </w:r>
+      <w:r>
+        <w:rPr>
+          <w:i/>
+          <w:iCs/>
+        </w:rPr>
+        <w:t>pcdh10b</w:t>
+      </w:r>
+      <w:r>
+        <w:t xml:space="preserve"> were significantly upregulated. Given that these </w:t>
+      </w:r>
+      <w:r>
+        <w:t>genes</w:t>
+      </w:r>
+      <w:r>
+        <w:t xml:space="preserve"> are associated with the formation and stabilization of synaptic connections, this suggests the intermediate state is characterized by synaptogenesis in [cluster 6]</w:t>
+      </w:r>
+      <w:r>
+        <w:t xml:space="preserve"> </w:t>
+      </w:r>
+      <w:r>
+        <w:t>(</w:t>
+      </w:r>
+      <w:r>
+        <w:rPr>
+          <w:highlight w:val="yellow"/>
+        </w:rPr>
+        <w:t>CITATIONS</w:t>
+      </w:r>
+      <w:r>
+        <w:t xml:space="preserve">). </w:t>
+      </w:r>
+    </w:p>
+    <w:p>
+      <w:pPr>
+        <w:ind w:firstLine="720"/>
+      </w:pPr>
+      <w:r>
+        <w:t>Additionally</w:t>
+      </w:r>
+      <w:r>
+        <w:t xml:space="preserve">, intermediates had significantly upregulated </w:t>
+      </w:r>
+      <w:r>
+        <w:rPr>
+          <w:i/>
+          <w:iCs/>
+        </w:rPr>
+        <w:t>sdc2</w:t>
+      </w:r>
+      <w:r>
+        <w:t xml:space="preserve"> and </w:t>
+      </w:r>
+      <w:proofErr w:type="spellStart"/>
+      <w:r>
+        <w:rPr>
+          <w:i/>
+          <w:iCs/>
+        </w:rPr>
+        <w:t>dse</w:t>
+      </w:r>
+      <w:proofErr w:type="spellEnd"/>
+      <w:r>
+        <w:rPr>
+          <w:i/>
+          <w:iCs/>
+        </w:rPr>
+        <w:t>-like</w:t>
+      </w:r>
+      <w:r>
+        <w:t xml:space="preserve">, </w:t>
+      </w:r>
+      <w:r>
+        <w:rPr>
+          <w:i/>
+          <w:iCs/>
+        </w:rPr>
+        <w:t>(</w:t>
+      </w:r>
+      <w:r>
+        <w:rPr>
+          <w:i/>
+          <w:iCs/>
+        </w:rPr>
+        <w:t>LOC111585095</w:t>
+      </w:r>
+      <w:r>
+        <w:t xml:space="preserve">), </w:t>
+      </w:r>
+      <w:r>
+        <w:t>along with a</w:t>
+      </w:r>
+      <w:r>
+        <w:t xml:space="preserve"> downregulation of </w:t>
+      </w:r>
+      <w:proofErr w:type="spellStart"/>
+      <w:r>
+        <w:rPr>
+          <w:i/>
+          <w:iCs/>
+        </w:rPr>
+        <w:t>bcan</w:t>
+      </w:r>
+      <w:proofErr w:type="spellEnd"/>
+      <w:r>
+        <w:t xml:space="preserve">. This suggests major remodeling of the extracellular matrix, particularly around the synapse. </w:t>
+      </w:r>
+      <w:proofErr w:type="spellStart"/>
+      <w:r>
+        <w:t>Syndecan</w:t>
+      </w:r>
+      <w:proofErr w:type="spellEnd"/>
+      <w:r>
+        <w:t xml:space="preserve"> 2 is a heparin sulfate proteoglycan which functions as a fibroblast growth factor coreceptor, while dermatan sulfate epimerases increase the flexibility of the extracellular matrix (ECM) (</w:t>
+      </w:r>
+      <w:r>
+        <w:rPr>
+          <w:highlight w:val="yellow"/>
+        </w:rPr>
+        <w:t>CITATIONS</w:t>
+      </w:r>
+      <w:r>
+        <w:t xml:space="preserve">). </w:t>
+      </w:r>
+      <w:r>
+        <w:t>Further</w:t>
+      </w:r>
+      <w:r>
+        <w:t xml:space="preserve">, brevican is a major constituent of perineuronal nets which restrict neuroplasticity (CITATION). </w:t>
+      </w:r>
+      <w:r>
+        <w:t>Additional</w:t>
+      </w:r>
+      <w:r>
+        <w:t xml:space="preserve"> evidence for ECM remodeling comes from the transient downregulation of, </w:t>
+      </w:r>
+      <w:r>
+        <w:rPr>
+          <w:i/>
+          <w:iCs/>
+        </w:rPr>
+        <w:t>cd87-like</w:t>
       </w:r>
       <w:r>
         <w:t xml:space="preserve"> (</w:t>
       </w:r>
       <w:r>
+        <w:t>LOC111577100</w:t>
+      </w:r>
+      <w:r>
+        <w:t xml:space="preserve">) in intermediates, before being strongly upregulated in females. </w:t>
+      </w:r>
+      <w:r>
+        <w:rPr>
+          <w:highlight w:val="red"/>
+        </w:rPr>
+        <w:t>CD87 promotes ECM degradation, its downregulation may suggest …?</w:t>
+      </w:r>
+      <w:r>
+        <w:t xml:space="preserve">  Taken together, these changes further support the notion that major synaptic plasticity occurs in intermediates in cluster 6.    </w:t>
+      </w:r>
+      <w:commentRangeEnd w:id="10"/>
+      <w:r>
+        <w:rPr>
+          <w:rStyle w:val="CommentReference"/>
+        </w:rPr>
+        <w:commentReference w:id="10"/>
+      </w:r>
+      <w:commentRangeEnd w:id="11"/>
+      <w:r>
+        <w:rPr>
+          <w:rStyle w:val="CommentReference"/>
+        </w:rPr>
+        <w:commentReference w:id="11"/>
+      </w:r>
+    </w:p>
+    <w:p/>
+    <w:p>
+      <w:pPr>
+        <w:rPr>
+          <w:b/>
+          <w:bCs/>
+        </w:rPr>
+      </w:pPr>
+      <w:r>
+        <w:rPr>
+          <w:b/>
+          <w:bCs/>
+        </w:rPr>
+        <w:t>[Cluster 6] Undergoes Changes in Neurotransmitter and Action Potential Characteristics</w:t>
+      </w:r>
+    </w:p>
+    <w:p>
+      <w:r>
+        <w:tab/>
+        <w:t>Interestingly, in our DEG analysis we found GABA and glutamate receptors to be differentially expressed over the course of sex change. Specifically, the metabotropic glutamate receptor (</w:t>
+      </w:r>
+      <w:r>
+        <w:rPr>
+          <w:i/>
+          <w:iCs/>
+        </w:rPr>
+        <w:t>grm5a</w:t>
+      </w:r>
+      <w:r>
+        <w:t>) was transiently downregulated in intermediates, while the type A GABA receptor (</w:t>
+      </w:r>
+      <w:r>
+        <w:rPr>
+          <w:i/>
+          <w:iCs/>
+        </w:rPr>
+        <w:t>gabra3</w:t>
+      </w:r>
+      <w:r>
+        <w:t>) was downregulated during the male-intermediate transition. This suggests that the intermediate state is characterized by a decrease in sensitivity to both GABA and glutamate (</w:t>
+      </w:r>
+      <w:r>
         <w:rPr>
           <w:highlight w:val="yellow"/>
         </w:rPr>
-        <w:t>Figure</w:t>
-      </w:r>
-      <w:r>
-        <w:t>)</w:t>
-      </w:r>
-      <w:r>
-        <w:t xml:space="preserve">. Interestingly, five of </w:t>
-      </w:r>
-      <w:r>
-        <w:t>the significant</w:t>
-      </w:r>
-      <w:r>
-        <w:t xml:space="preserve"> changes</w:t>
-      </w:r>
-      <w:r>
-        <w:t xml:space="preserve"> we detected</w:t>
-      </w:r>
-      <w:r>
-        <w:t xml:space="preserve"> were transient changes in intermediates, with three transient </w:t>
-      </w:r>
-      <w:r>
-        <w:t>decreases</w:t>
-      </w:r>
-      <w:r>
-        <w:t xml:space="preserve"> and one transient </w:t>
-      </w:r>
-      <w:r>
-        <w:t>increase in population</w:t>
-      </w:r>
-      <w:r>
-        <w:t xml:space="preserve">. The two transient downregulations occurred in neurons (cluster 4 </w:t>
-      </w:r>
-      <w:r>
-        <w:rPr>
-          <w:highlight w:val="yellow"/>
-        </w:rPr>
-        <w:t>LABEL</w:t>
-      </w:r>
-      <w:r>
-        <w:t xml:space="preserve">, and cluster 7 </w:t>
-      </w:r>
-      <w:r>
-        <w:rPr>
-          <w:highlight w:val="yellow"/>
-        </w:rPr>
-        <w:t>LABEL</w:t>
-      </w:r>
-      <w:r>
-        <w:t>), while the transient increase occurred in radial glia (</w:t>
-      </w:r>
-      <w:r>
-        <w:rPr>
-          <w:highlight w:val="yellow"/>
-        </w:rPr>
-        <w:t>Figure</w:t>
-      </w:r>
-      <w:r>
-        <w:t xml:space="preserve">). </w:t>
-      </w:r>
-      <w:r>
-        <w:t xml:space="preserve"> </w:t>
-      </w:r>
-      <w:r>
-        <w:rPr>
-          <w:highlight w:val="cyan"/>
-        </w:rPr>
-        <w:t>(Should we add a “This supports the idea…” here)</w:t>
-      </w:r>
-      <w:r>
-        <w:t>.</w:t>
+        <w:t>consistent with the synaptic plasticity that is occurring</w:t>
+      </w:r>
+      <w:r>
+        <w:t>?), and during the intermediate-female transition, glutamate sensitivity returns while GABA receptivity remains suppressed.</w:t>
       </w:r>
     </w:p>
     <w:p>
       <w:r>
         <w:tab/>
-        <w:t>Because large scale changes in glial populations may obscure more subtle changes in neuronal population and because we have previously shown that sex change is associated with extensive neurogenesis</w:t>
+        <w:t xml:space="preserve">Further, our DEG analysis detected a switch in voltage-gated potassium channel subtype. During the intermediate-female transition, </w:t>
+      </w:r>
+      <w:r>
+        <w:rPr>
+          <w:i/>
+          <w:iCs/>
+        </w:rPr>
+        <w:t xml:space="preserve">kcnh4-like </w:t>
+      </w:r>
+      <w:r>
+        <w:t>(</w:t>
+      </w:r>
+      <w:r>
+        <w:rPr>
+          <w:i/>
+          <w:iCs/>
+        </w:rPr>
+        <w:t>LOC111566724</w:t>
+      </w:r>
+      <w:r>
+        <w:t xml:space="preserve">) was upregulated, while </w:t>
+      </w:r>
+      <w:r>
+        <w:rPr>
+          <w:i/>
+          <w:iCs/>
+        </w:rPr>
+        <w:t xml:space="preserve">kcnd3-like </w:t>
+      </w:r>
+      <w:r>
+        <w:t>(</w:t>
+      </w:r>
+      <w:r>
+        <w:rPr>
+          <w:i/>
+          <w:iCs/>
+        </w:rPr>
+        <w:t>LOC111576659</w:t>
+      </w:r>
+      <w:r>
+        <w:t xml:space="preserve">) was downregulated. Given </w:t>
+      </w:r>
+      <w:r>
+        <w:rPr>
+          <w:i/>
+          <w:iCs/>
+        </w:rPr>
+        <w:t>kcnh4</w:t>
+      </w:r>
+      <w:r>
+        <w:t xml:space="preserve"> encodes an Elk subfamily potassium channel (Kv12.3), which are characterized by slow opening during hyperpolarization which prevents hyperexcitability and inhibit rapid firing </w:t>
       </w:r>
       <w:r>
         <w:fldChar w:fldCharType="begin"/>
       </w:r>
       <w:r>
-        <w:instrText xml:space="preserve"> ADDIN ZOTERO_ITEM CSL_CITATION {"citationID":"xw8l5HJS","properties":{"formattedCitation":"\\super 12\\nosupersub{}","plainCitation":"12","noteIndex":0},"citationItems":[{"id":16,"uris":["http://zotero.org/users/11313215/items/VGA9PBJ3"],"itemData":{"id":16,"type":"article-journal","abstract":"Sex differences in cell number in the preoptic area of the hypothalamus (POA) are documented across all major vertebrate lineages and contribute to differential regulation of the hypothalamic-pituitary-gonad axis and reproductive behavior between the sexes. Sex-changing fishes provide a unique opportunity to study mechanisms underlying sexual differentiation of the POA. In anemonefish (clownfish), which change sex from male to female, females have approximately twice the number of medium-sized cells in the anterior POA compared to males. This sex difference transitions from male-like to female-like during sex change. However, it is not known how this sex difference in POA cell number is established. This study tests the hypothesis that new cell addition plays a role. We initiated adult male-to-female sex change in 30 anemonefish (Amphiprion ocellaris) and administered BrdU to label new cells added to the POA at regular intervals throughout sex change. Sex-changing fish added more new cells to the anterior POA than non-changing fish, supporting the hypothesis. The observed effects could be accounted for by differences in POA volume, but they are also consistent with a steady trickle of new cells being gradually accumulated in the anterior POA before vitellogenic oocytes develop in the gonads. These results provide insight into the unique characteristics of protandrous sex change in anemonefish relative to other modes of sex change, and support the potential for future research in sex-changing fishes to provide a richer under­ standing of the mechanisms for sexual differentiation of the brain.","container-title":"General and Comparative Endocrinology","DOI":"10.1016/j.ygcen.2022.114185","ISSN":"00166480","journalAbbreviation":"General and Comparative Endocrinology","language":"en","page":"114185","source":"DOI.org (Crossref)","title":"New cells added to the preoptic area during sex change in the common clownfish Amphiprion ocellaris","volume":"333","author":[{"family":"Parker","given":"Coltan G."},{"family":"Craig","given":"Sarah E."},{"family":"Histed","given":"Abigail R."},{"family":"Lee","given":"Joanne S."},{"family":"Ibanez","given":"Emma"},{"family":"Pronitcheva","given":"Veronica"},{"family":"Rhodes","given":"Justin S."}],"issued":{"date-parts":[["2023",3]]}}}],"schema":"https://github.com/citation-style-language/schema/raw/master/csl-citation.json"} </w:instrText>
+        <w:instrText xml:space="preserve"> ADDIN ZOTERO_ITEM CSL_CITATION {"citationID":"PzQ8bTuB","properties":{"formattedCitation":"\\super 18,19\\nosupersub{}","plainCitation":"18,19","noteIndex":0},"citationItems":[{"id":5437,"uris":["http://zotero.org/users/11313215/items/A8F4HTW8"],"itemData":{"id":5437,"type":"article-journal","abstract":"EAG-like (ELK) voltage-gated potassium channels are abundantly expressed in the brain. These channels exhibit a behavior called voltage-dependent potentiation (VDP), which appears to be a specialization to dampen the hyperexitability of neurons. VDP manifests as a potentiation of current amplitude, hyperpolarizing shift in voltage sensitivity, and slowing of deactivation in response to a depolarizing prepulse. Here we show that VDP of D. rerio ELK channels involves the structural interaction between the intracellular N-terminal eag domain and C-terminal CNBHD. Combining transition metal ion FRET, patch-clamp fluorometry, and incorporation of a fluorescent noncanonical amino acid, we show that there is a rearrangement in the eag domain-CNBHD interaction with the kinetics, voltage-dependence, and ATP-dependence of VDP. We propose that the activation of ELK channels involves a slow open-state dependent rearrangement of the direct interaction between the eag domain and CNBHD, which stabilizes the opening of the channel.","container-title":"eLife","DOI":"10.7554/eLife.26355","ISSN":"2050-084X","note":"publisher: eLife Sciences Publications, Ltd","page":"e26355","source":"eLife","title":"Molecular mechanism of voltage-dependent potentiation of KCNH potassium channels","volume":"6","author":[{"family":"Dai","given":"Gucan"},{"family":"Zagotta","given":"William N"}],"editor":[{"family":"Chanda","given":"Baron"}],"issued":{"date-parts":[["2017",4,26]]}}},{"id":5439,"uris":["http://zotero.org/users/11313215/items/NEID8FVD"],"itemData":{"id":5439,"type":"article-journal","abstract":"The Elk subfamily of the Eag K+ channel gene family is represented in mammals by three genes that are highly conserved between humans and rodents. Here we report the distribution and functional properties of a member of the human Elk K+ channel gene family, KCNH8. Quantitative RT-PCR analysis of mRNA expression patterns showed that KCNH8, along with the other Elk family genes, KCNH3 and KCNH4, are primarily expressed in the human nervous system. KCNH8 was expressed at high levels, and the distribution showed substantial overlap with KCNH3. In Xenopus oocytes, KCNH8 gives rise to slowly activating, voltage-dependent K+ currents that open at hyperpolarized potentials (half-maximal activation at -62 mV). Coexpression of KCNH8 with dominant-negative KCNH8, KCNH3, and KCNH4 subunits led to suppression of the KCNH8 currents, suggesting that Elk channels can form heteromultimers. Similar experiments imply that KCNH8 subunits are not able to form heteromultimers with Eag, Erg, or Kv family K+ channels.","container-title":"American Journal of Physiology-Cell Physiology","DOI":"10.1152/ajpcell.00179.2003","ISSN":"0363-6143","issue":"6","note":"publisher: American Physiological Society","page":"C1356-C1366","source":"journals.physiology.org (Atypon)","title":"Distribution and functional properties of human KCNH8 (Elk1) potassium channels","volume":"285","author":[{"family":"Zou","given":"Anruo"},{"family":"Lin","given":"Zhixin"},{"family":"Humble","given":"Margaret"},{"family":"Creech","given":"Christopher D."},{"family":"Wagoner","given":"P. Kay"},{"family":"Krafte","given":"Douglas"},{"family":"Jegla","given":"Timothy J."},{"family":"Wickenden","given":"Alan D."}],"issued":{"date-parts":[["2003",12]]}}}],"schema":"https://github.com/citation-style-language/schema/raw/master/csl-citation.json"} </w:instrText>
       </w:r>
       <w:r>
         <w:fldChar w:fldCharType="separate"/>
@@ -1304,546 +1926,633 @@
           <w:szCs w:val="24"/>
           <w:vertAlign w:val="superscript"/>
         </w:rPr>
-        <w:t>12</w:t>
+        <w:t>18,19</w:t>
       </w:r>
       <w:r>
         <w:fldChar w:fldCharType="end"/>
       </w:r>
       <w:r>
-        <w:t>, we next analyzed changes in proportion only considering neuronal cell types. Of the 20 neuronal clusters we analyzed, 11 (55%) changed in population, with four decreasing in size and seven increasing. Of these, several clusters mapping to the POA changed in population. In the male-intermediate transition, we found significant increases in clusters 14 (</w:t>
-      </w:r>
-      <w:r>
-        <w:rPr>
-          <w:highlight w:val="yellow"/>
-        </w:rPr>
-        <w:t>LABEL</w:t>
-      </w:r>
-      <w:r>
-        <w:t>), 17 (</w:t>
-      </w:r>
-      <w:r>
-        <w:rPr>
-          <w:highlight w:val="yellow"/>
-        </w:rPr>
-        <w:t>LABEL</w:t>
-      </w:r>
-      <w:r>
-        <w:t>), and 18). In intermediates, we found a transient increase in the population of cluster 0 (</w:t>
-      </w:r>
-      <w:r>
-        <w:rPr>
-          <w:highlight w:val="yellow"/>
-        </w:rPr>
-        <w:t>LABEL</w:t>
-      </w:r>
-      <w:r>
-        <w:t>), and a transient decrease in cluster 4 (</w:t>
-      </w:r>
-      <w:r>
-        <w:rPr>
-          <w:highlight w:val="yellow"/>
-        </w:rPr>
-        <w:t>LABEL</w:t>
-      </w:r>
-      <w:r>
-        <w:t>). Interestingly, we found a significant increase in intermediate-female transition in clusters 6 (</w:t>
-      </w:r>
-      <w:r>
-        <w:rPr>
-          <w:highlight w:val="yellow"/>
-        </w:rPr>
-        <w:t>LABEL</w:t>
-      </w:r>
-      <w:r>
-        <w:t>) and 19 (</w:t>
-      </w:r>
-      <w:r>
-        <w:rPr>
-          <w:highlight w:val="yellow"/>
-        </w:rPr>
-        <w:t>LABEL</w:t>
+        <w:t xml:space="preserve">, upregulation of this channel subtype suggests a decrease in the maximal firing rate of cluster 6 neurons. On the other hand, </w:t>
+      </w:r>
+      <w:r>
+        <w:rPr>
+          <w:i/>
+          <w:iCs/>
+        </w:rPr>
+        <w:t>kcnd3</w:t>
+      </w:r>
+      <w:r>
+        <w:t xml:space="preserve"> encodes Kv4.3 which regulates A-type potassium currents, prolonging action potential duration and increasing spike frequency adaptation. </w:t>
+      </w:r>
+      <w:commentRangeStart w:id="12"/>
+      <w:r>
+        <w:t>Taken together, these potassium channel changes suggest that during the intermediate-female transition, cluster 6 neurons increase the ability to produce long action potential bursts</w:t>
+      </w:r>
+      <w:r>
+        <w:t>.</w:t>
+      </w:r>
+      <w:commentRangeEnd w:id="12"/>
+      <w:r>
+        <w:rPr>
+          <w:rStyle w:val="CommentReference"/>
+        </w:rPr>
+        <w:commentReference w:id="12"/>
+      </w:r>
+    </w:p>
+    <w:p/>
+    <w:p>
+      <w:pPr>
+        <w:rPr>
+          <w:b/>
+          <w:bCs/>
+        </w:rPr>
+      </w:pPr>
+      <w:r>
+        <w:rPr>
+          <w:b/>
+          <w:bCs/>
+        </w:rPr>
+        <w:lastRenderedPageBreak/>
+        <w:t>[Cluster 6] Changes Receptivity to Neuropeptides, Neuromodulators, and Steroid Hormones</w:t>
+      </w:r>
+    </w:p>
+    <w:p>
+      <w:r>
+        <w:rPr>
+          <w:b/>
+          <w:bCs/>
+        </w:rPr>
+        <w:tab/>
+      </w:r>
+      <w:commentRangeStart w:id="13"/>
+      <w:r>
+        <w:t xml:space="preserve">Early in sex change during the male-intermediate transition, we observed a significant downregulation in the </w:t>
+      </w:r>
+      <w:proofErr w:type="spellStart"/>
+      <w:r>
+        <w:rPr>
+          <w:i/>
+          <w:iCs/>
+        </w:rPr>
+        <w:t>nmbr</w:t>
+      </w:r>
+      <w:proofErr w:type="spellEnd"/>
+      <w:r>
+        <w:t xml:space="preserve">, and </w:t>
+      </w:r>
+      <w:r>
+        <w:rPr>
+          <w:i/>
+          <w:iCs/>
+        </w:rPr>
+        <w:t>npy7r</w:t>
+      </w:r>
+      <w:r>
+        <w:t xml:space="preserve">. Further, during the intermediate-female transition, the </w:t>
+      </w:r>
+      <w:r>
+        <w:rPr>
+          <w:i/>
+          <w:iCs/>
+        </w:rPr>
+        <w:t>tacr3a</w:t>
+      </w:r>
+      <w:r>
+        <w:t xml:space="preserve"> was significantly downregulated. Given </w:t>
+      </w:r>
+      <w:proofErr w:type="spellStart"/>
+      <w:r>
+        <w:t>neuromedin</w:t>
+      </w:r>
+      <w:proofErr w:type="spellEnd"/>
+      <w:r>
+        <w:t xml:space="preserve"> b inhibits feeding behavior, while tachykinin and neuropeptide y stimulate feeding, their parallel downregulation is perplexing</w:t>
+      </w:r>
+      <w:commentRangeEnd w:id="13"/>
+      <w:r>
+        <w:rPr>
+          <w:rStyle w:val="CommentReference"/>
+        </w:rPr>
+        <w:commentReference w:id="13"/>
+      </w:r>
+      <w:r>
+        <w:t xml:space="preserve">. </w:t>
+      </w:r>
+    </w:p>
+    <w:p>
+      <w:r>
+        <w:tab/>
+        <w:t xml:space="preserve">Surprisingly, during the intermediate-female transition, the dopamine receptor </w:t>
+      </w:r>
+      <w:r>
+        <w:rPr>
+          <w:i/>
+          <w:iCs/>
+        </w:rPr>
+        <w:t>drd3</w:t>
+      </w:r>
+      <w:r>
+        <w:t xml:space="preserve"> was also significantly upregulated. Dopamine in the POA is largely thought to mediate male sexual behaviors … </w:t>
+      </w:r>
+    </w:p>
+    <w:p>
+      <w:r>
+        <w:t xml:space="preserve">Interestingly in intermediates, the progesterone receptor </w:t>
+      </w:r>
+      <w:proofErr w:type="spellStart"/>
+      <w:r>
+        <w:rPr>
+          <w:i/>
+          <w:iCs/>
+        </w:rPr>
+        <w:t>pgr</w:t>
+      </w:r>
+      <w:proofErr w:type="spellEnd"/>
+      <w:r>
+        <w:t xml:space="preserve"> was significantly downregulated, before a significant upregulation once the transition to female was completed. Further, during the intermediate-female transition, </w:t>
+      </w:r>
+      <w:commentRangeStart w:id="14"/>
+      <w:commentRangeStart w:id="15"/>
+      <w:proofErr w:type="spellStart"/>
+      <w:r>
+        <w:rPr>
+          <w:i/>
+          <w:iCs/>
+        </w:rPr>
+        <w:t>pgr</w:t>
+      </w:r>
+      <w:proofErr w:type="spellEnd"/>
+      <w:r>
+        <w:rPr>
+          <w:i/>
+          <w:iCs/>
+        </w:rPr>
+        <w:t xml:space="preserve">-like </w:t>
+      </w:r>
+      <w:r>
+        <w:t>(</w:t>
+      </w:r>
+      <w:r>
+        <w:rPr>
+          <w:i/>
+          <w:iCs/>
+        </w:rPr>
+        <w:t>LOC111568069</w:t>
       </w:r>
       <w:r>
         <w:t>)</w:t>
       </w:r>
-      <w:r>
-        <w:t>, and decreases in 9 (</w:t>
-      </w:r>
-      <w:r>
-        <w:rPr>
-          <w:highlight w:val="yellow"/>
-        </w:rPr>
-        <w:t>LABEL</w:t>
-      </w:r>
-      <w:r>
-        <w:t>), 22 (</w:t>
-      </w:r>
-      <w:r>
-        <w:rPr>
-          <w:highlight w:val="yellow"/>
-        </w:rPr>
-        <w:t>LABEL</w:t>
-      </w:r>
-      <w:r>
-        <w:t>), and 24 (</w:t>
-      </w:r>
-      <w:r>
-        <w:rPr>
-          <w:highlight w:val="yellow"/>
-        </w:rPr>
-        <w:t>LABEL</w:t>
+      <w:commentRangeEnd w:id="14"/>
+      <w:r>
+        <w:rPr>
+          <w:rStyle w:val="CommentReference"/>
+        </w:rPr>
+        <w:commentReference w:id="14"/>
+      </w:r>
+      <w:commentRangeEnd w:id="15"/>
+      <w:r>
+        <w:rPr>
+          <w:rStyle w:val="CommentReference"/>
+        </w:rPr>
+        <w:commentReference w:id="15"/>
+      </w:r>
+    </w:p>
+    <w:p/>
+    <w:p/>
+    <w:p>
+      <w:pPr>
+        <w:rPr>
+          <w:b/>
+          <w:bCs/>
+          <w:i/>
+          <w:iCs/>
+        </w:rPr>
+      </w:pPr>
+      <w:r>
+        <w:rPr>
+          <w:b/>
+          <w:bCs/>
+          <w:i/>
+          <w:iCs/>
+        </w:rPr>
+        <w:t>[Cluster 6] Is Composed of Several Hypothalamic Cell Types</w:t>
+      </w:r>
+    </w:p>
+    <w:p>
+      <w:r>
+        <w:rPr>
+          <w:i/>
+          <w:iCs/>
+        </w:rPr>
+        <w:tab/>
+      </w:r>
+      <w:r>
+        <w:t xml:space="preserve">Our cell type analysis </w:t>
+      </w:r>
+      <w:r>
+        <w:t xml:space="preserve">of </w:t>
+      </w:r>
+      <w:r>
+        <w:t>6_POA_2</w:t>
+      </w:r>
+      <w:r>
+        <w:t xml:space="preserve"> </w:t>
+      </w:r>
+      <w:r>
+        <w:t>showed the cluster was positive for</w:t>
+      </w:r>
+      <w:r>
+        <w:t xml:space="preserve"> markers for several hypothalamic cell types including magnocellular and parvocellular neurosecretory preoptic area (NPO), gonadotropin releasing hormone (GnRH) neurons, and arcuate nucleus (ARC) neurons. We hypothesized</w:t>
+      </w:r>
+      <w:r>
+        <w:t xml:space="preserve"> that this cluster may be several hypothalamic cell types that clustered together, and</w:t>
+      </w:r>
+      <w:r>
+        <w:t xml:space="preserve"> that </w:t>
+      </w:r>
+      <w:proofErr w:type="spellStart"/>
+      <w:r>
+        <w:t>subclustering</w:t>
+      </w:r>
+      <w:proofErr w:type="spellEnd"/>
+      <w:r>
+        <w:t xml:space="preserve"> </w:t>
+      </w:r>
+      <w:r>
+        <w:t xml:space="preserve">would separate these cell types into clusters that better aligned with </w:t>
+      </w:r>
+      <w:r>
+        <w:rPr>
+          <w:i/>
+          <w:iCs/>
+        </w:rPr>
+        <w:t>a priori</w:t>
+      </w:r>
+      <w:r>
+        <w:t xml:space="preserve"> knowledge about hypothalamic cell types.</w:t>
+      </w:r>
+    </w:p>
+    <w:p>
+      <w:pPr>
+        <w:ind w:firstLine="720"/>
+      </w:pPr>
+      <w:r>
+        <w:t xml:space="preserve"> </w:t>
+      </w:r>
+      <w:r>
+        <w:t xml:space="preserve">Indeed, </w:t>
+      </w:r>
+      <w:proofErr w:type="spellStart"/>
+      <w:r>
+        <w:t>s</w:t>
+      </w:r>
+      <w:r>
+        <w:t>ubclustering</w:t>
+      </w:r>
+      <w:proofErr w:type="spellEnd"/>
+      <w:r>
+        <w:t xml:space="preserve"> resulted in 4 subclusters (6_0 through 6_3</w:t>
+      </w:r>
+      <w:r>
+        <w:t>, Fig. 3a</w:t>
+      </w:r>
+      <w:r>
+        <w:t>). Cluster 6_0</w:t>
+      </w:r>
+      <w:r>
+        <w:t xml:space="preserve"> was marked by expression for the homeobox transcription factors </w:t>
+      </w:r>
+      <w:r>
+        <w:rPr>
+          <w:i/>
+          <w:iCs/>
+        </w:rPr>
+        <w:t xml:space="preserve">hmx2, hmx3a, </w:t>
+      </w:r>
+      <w:r>
+        <w:t xml:space="preserve">and </w:t>
+      </w:r>
+      <w:r>
+        <w:rPr>
+          <w:i/>
+          <w:iCs/>
+        </w:rPr>
+        <w:t>lhx1a.</w:t>
+      </w:r>
+      <w:r>
+        <w:t xml:space="preserve"> Further, 6_0</w:t>
+      </w:r>
+      <w:r>
+        <w:t xml:space="preserve"> expressed several steroid hormone receptors including </w:t>
+      </w:r>
+      <w:r>
+        <w:rPr>
+          <w:i/>
+          <w:iCs/>
+        </w:rPr>
+        <w:t xml:space="preserve">esr2b, </w:t>
+      </w:r>
+      <w:proofErr w:type="spellStart"/>
+      <w:r>
+        <w:rPr>
+          <w:i/>
+          <w:iCs/>
+        </w:rPr>
+        <w:t>ar</w:t>
+      </w:r>
+      <w:proofErr w:type="spellEnd"/>
+      <w:r>
+        <w:rPr>
+          <w:i/>
+          <w:iCs/>
+        </w:rPr>
+        <w:t xml:space="preserve">, </w:t>
+      </w:r>
+      <w:r>
+        <w:t>and</w:t>
+      </w:r>
+      <w:r>
+        <w:t xml:space="preserve"> </w:t>
+      </w:r>
+      <w:proofErr w:type="spellStart"/>
+      <w:r>
+        <w:t>pgr</w:t>
+      </w:r>
+      <w:proofErr w:type="spellEnd"/>
+      <w:r>
+        <w:t xml:space="preserve"> </w:t>
+      </w:r>
+      <w:r>
+        <w:t>and neuropeptide receptors</w:t>
+      </w:r>
+      <w:r>
+        <w:t xml:space="preserve"> </w:t>
+      </w:r>
+      <w:proofErr w:type="spellStart"/>
+      <w:r>
+        <w:rPr>
+          <w:i/>
+          <w:iCs/>
+        </w:rPr>
+        <w:t>cckbra</w:t>
+      </w:r>
+      <w:proofErr w:type="spellEnd"/>
+      <w:r>
+        <w:rPr>
+          <w:i/>
+          <w:iCs/>
+        </w:rPr>
+        <w:t xml:space="preserve"> tacr1a, </w:t>
+      </w:r>
+      <w:r>
+        <w:t xml:space="preserve">and </w:t>
+      </w:r>
+      <w:r>
+        <w:rPr>
+          <w:i/>
+          <w:iCs/>
+        </w:rPr>
+        <w:t xml:space="preserve">tacr3a, </w:t>
+      </w:r>
+      <w:r>
+        <w:t xml:space="preserve">and the cholecystokinin ligands </w:t>
+      </w:r>
+      <w:proofErr w:type="spellStart"/>
+      <w:r>
+        <w:rPr>
+          <w:i/>
+          <w:iCs/>
+        </w:rPr>
+        <w:t>ccka</w:t>
+      </w:r>
+      <w:proofErr w:type="spellEnd"/>
+      <w:r>
+        <w:rPr>
+          <w:i/>
+          <w:iCs/>
+        </w:rPr>
+        <w:t xml:space="preserve"> </w:t>
+      </w:r>
+      <w:r>
+        <w:t>(</w:t>
+      </w:r>
+      <w:r>
+        <w:rPr>
+          <w:i/>
+          <w:iCs/>
+        </w:rPr>
+        <w:t>LOC111562384</w:t>
+      </w:r>
+      <w:r>
+        <w:t xml:space="preserve">) and </w:t>
+      </w:r>
+      <w:proofErr w:type="spellStart"/>
+      <w:r>
+        <w:rPr>
+          <w:i/>
+          <w:iCs/>
+        </w:rPr>
+        <w:t>cckb</w:t>
+      </w:r>
+      <w:proofErr w:type="spellEnd"/>
+      <w:r>
+        <w:t xml:space="preserve">. Thus, we hereafter refer to this cell type as </w:t>
+      </w:r>
+      <w:r>
+        <w:t>6_Steroid Receptor</w:t>
+      </w:r>
+      <w:r>
+        <w:t xml:space="preserve"> (</w:t>
+      </w:r>
+      <w:r>
+        <w:t>6_</w:t>
+      </w:r>
+      <w:r>
+        <w:t>SR).</w:t>
+      </w:r>
+    </w:p>
+    <w:p>
+      <w:pPr>
+        <w:ind w:firstLine="720"/>
+      </w:pPr>
+      <w:commentRangeStart w:id="16"/>
+      <w:r>
+        <w:t>Cluster 6_1 was marked by expression of</w:t>
+      </w:r>
+      <w:r>
+        <w:t xml:space="preserve"> the transcription factors</w:t>
+      </w:r>
+      <w:r>
+        <w:t xml:space="preserve"> </w:t>
+      </w:r>
+      <w:commentRangeStart w:id="17"/>
+      <w:r>
+        <w:rPr>
+          <w:i/>
+          <w:iCs/>
+        </w:rPr>
+        <w:t>sox</w:t>
+      </w:r>
+      <w:r>
+        <w:rPr>
+          <w:i/>
+          <w:iCs/>
+        </w:rPr>
+        <w:t>2</w:t>
+      </w:r>
+      <w:commentRangeEnd w:id="17"/>
+      <w:r>
+        <w:rPr>
+          <w:i/>
+          <w:iCs/>
+        </w:rPr>
+        <w:t xml:space="preserve"> </w:t>
+      </w:r>
+      <w:r>
+        <w:t>(</w:t>
+      </w:r>
+      <w:r>
+        <w:rPr>
+          <w:rStyle w:val="CommentReference"/>
+        </w:rPr>
+        <w:commentReference w:id="17"/>
+      </w:r>
+      <w:r>
+        <w:rPr>
+          <w:i/>
+          <w:iCs/>
+        </w:rPr>
+        <w:t>LOC111583585</w:t>
       </w:r>
       <w:r>
         <w:t>)</w:t>
       </w:r>
       <w:r>
+        <w:t>,</w:t>
+      </w:r>
+      <w:r>
+        <w:t xml:space="preserve"> </w:t>
+      </w:r>
+      <w:r>
+        <w:rPr>
+          <w:i/>
+          <w:iCs/>
+        </w:rPr>
+        <w:t xml:space="preserve">sox5, </w:t>
+      </w:r>
+      <w:r>
+        <w:t>and</w:t>
+      </w:r>
+      <w:r>
+        <w:t xml:space="preserve"> </w:t>
+      </w:r>
+      <w:proofErr w:type="spellStart"/>
+      <w:r>
+        <w:rPr>
+          <w:i/>
+          <w:iCs/>
+        </w:rPr>
+        <w:t>rorb</w:t>
+      </w:r>
+      <w:proofErr w:type="spellEnd"/>
+      <w:r>
+        <w:t>. It expressed</w:t>
+      </w:r>
+      <w:r>
+        <w:t xml:space="preserve"> </w:t>
+      </w:r>
+      <w:r>
+        <w:t xml:space="preserve">the neuropeptides </w:t>
+      </w:r>
+      <w:r>
+        <w:rPr>
+          <w:i/>
+          <w:iCs/>
+        </w:rPr>
+        <w:t>gal</w:t>
+      </w:r>
+      <w:r>
+        <w:rPr>
+          <w:i/>
+          <w:iCs/>
+        </w:rPr>
+        <w:t xml:space="preserve">, </w:t>
+      </w:r>
+      <w:proofErr w:type="spellStart"/>
+      <w:r>
+        <w:rPr>
+          <w:i/>
+          <w:iCs/>
+        </w:rPr>
+        <w:t>npy</w:t>
+      </w:r>
+      <w:proofErr w:type="spellEnd"/>
+      <w:r>
+        <w:rPr>
+          <w:i/>
+          <w:iCs/>
+        </w:rPr>
+        <w:t>, tac,</w:t>
+      </w:r>
+      <w:r>
+        <w:t xml:space="preserve"> and </w:t>
+      </w:r>
+      <w:r>
+        <w:rPr>
+          <w:i/>
+          <w:iCs/>
+        </w:rPr>
+        <w:t xml:space="preserve">prlh2 </w:t>
+      </w:r>
+      <w:r>
+        <w:t>as well as the thyrotropin releasing hormone receptors</w:t>
+      </w:r>
+      <w:r>
+        <w:t xml:space="preserve"> </w:t>
+      </w:r>
+      <w:proofErr w:type="spellStart"/>
+      <w:r>
+        <w:rPr>
+          <w:i/>
+          <w:iCs/>
+        </w:rPr>
+        <w:t>trhra</w:t>
+      </w:r>
+      <w:proofErr w:type="spellEnd"/>
+      <w:r>
+        <w:rPr>
+          <w:i/>
+          <w:iCs/>
+        </w:rPr>
+        <w:t xml:space="preserve"> </w:t>
+      </w:r>
+      <w:r>
+        <w:t xml:space="preserve">and </w:t>
+      </w:r>
+      <w:proofErr w:type="spellStart"/>
+      <w:r>
+        <w:rPr>
+          <w:i/>
+          <w:iCs/>
+        </w:rPr>
+        <w:t>trhrb</w:t>
+      </w:r>
+      <w:proofErr w:type="spellEnd"/>
+      <w:r>
+        <w:rPr>
+          <w:i/>
+          <w:iCs/>
+        </w:rPr>
         <w:t xml:space="preserve">. </w:t>
       </w:r>
-      <w:commentRangeEnd w:id="7"/>
-      <w:r>
-        <w:rPr>
-          <w:rStyle w:val="CommentReference"/>
-        </w:rPr>
-        <w:commentReference w:id="7"/>
-      </w:r>
-    </w:p>
-    <w:p>
-      <w:pPr>
-        <w:rPr>
-          <w:b/>
-          <w:bCs/>
-        </w:rPr>
-      </w:pPr>
-      <w:r>
-        <w:rPr>
-          <w:b/>
-          <w:bCs/>
-        </w:rPr>
-        <w:t>Transcriptomic Changes Associated with Sex Change</w:t>
-      </w:r>
-    </w:p>
-    <w:p>
-      <w:r>
-        <w:rPr>
-          <w:b/>
-          <w:bCs/>
-        </w:rPr>
-        <w:tab/>
-      </w:r>
-      <w:r>
-        <w:t xml:space="preserve">To characterize the transcriptomic changes associated with sex change in the POA, we next </w:t>
-      </w:r>
-      <w:r>
-        <w:t>analy</w:t>
-      </w:r>
-      <w:r>
-        <w:t>zed differentially expressed genes</w:t>
-      </w:r>
-      <w:r>
-        <w:t xml:space="preserve"> by phase</w:t>
-      </w:r>
-      <w:r>
-        <w:t xml:space="preserve"> (DEGs). Genes that significantly differed </w:t>
-      </w:r>
-      <w:r>
-        <w:t xml:space="preserve">between phases </w:t>
-      </w:r>
-      <w:r>
-        <w:t>were then further classified by their pairwise pattern across the three major groups (</w:t>
-      </w:r>
-      <w:r>
-        <w:rPr>
-          <w:highlight w:val="yellow"/>
-        </w:rPr>
-        <w:t>see supplementary methods…</w:t>
-      </w:r>
-      <w:r>
-        <w:t xml:space="preserve">). In total, we detected 290 </w:t>
-      </w:r>
-      <w:r>
-        <w:t>DEG</w:t>
-      </w:r>
-      <w:r>
-        <w:t xml:space="preserve">s, of which 140 were </w:t>
-      </w:r>
-      <w:r>
-        <w:t>downregulated</w:t>
-      </w:r>
-      <w:r>
-        <w:t xml:space="preserve"> and</w:t>
-      </w:r>
-      <w:r>
-        <w:t xml:space="preserve"> 150 were upregulated. We found DEGs were biased in clusters 6 (</w:t>
-      </w:r>
-      <w:r>
-        <w:rPr>
-          <w:highlight w:val="yellow"/>
-        </w:rPr>
-        <w:t>LABEL</w:t>
-      </w:r>
-      <w:r>
-        <w:t>), 1 (Radial Glia), 0 (</w:t>
-      </w:r>
-      <w:r>
-        <w:rPr>
-          <w:highlight w:val="yellow"/>
-        </w:rPr>
-        <w:t>LABEL</w:t>
-      </w:r>
-      <w:r>
-        <w:t>), and 11 (Microglia) (</w:t>
-      </w:r>
-      <w:r>
-        <w:rPr>
-          <w:highlight w:val="yellow"/>
-        </w:rPr>
-        <w:t>Figure</w:t>
-      </w:r>
-      <w:r>
-        <w:t>)</w:t>
-      </w:r>
-      <w:r>
-        <w:t xml:space="preserve"> Of the 290 DEGs, 153 significantly </w:t>
-      </w:r>
-      <w:r>
-        <w:lastRenderedPageBreak/>
-        <w:t>differed between males and intermediates, 214 differed between females and intermediates, and 234 differed between females and males</w:t>
-      </w:r>
-      <w:r>
-        <w:t xml:space="preserve">. </w:t>
-      </w:r>
-      <w:r>
-        <w:t>(</w:t>
-      </w:r>
-      <w:r>
-        <w:rPr>
-          <w:highlight w:val="cyan"/>
-        </w:rPr>
-        <w:t>What more would a reader want to see here?</w:t>
-      </w:r>
-      <w:r>
-        <w:t>)</w:t>
-      </w:r>
-    </w:p>
-    <w:p>
-      <w:pPr>
-        <w:rPr>
-          <w:b/>
-          <w:bCs/>
-        </w:rPr>
-      </w:pPr>
-      <w:r>
-        <w:rPr>
-          <w:b/>
-          <w:bCs/>
-        </w:rPr>
-        <w:t xml:space="preserve">Radial Glia Undergo </w:t>
-      </w:r>
-      <w:r>
-        <w:rPr>
-          <w:b/>
-          <w:bCs/>
-        </w:rPr>
-        <w:t xml:space="preserve">Developmental-Like Transcription Factor Transitions </w:t>
-      </w:r>
-      <w:r>
-        <w:rPr>
-          <w:b/>
-          <w:bCs/>
-        </w:rPr>
-        <w:t>During</w:t>
-      </w:r>
-      <w:r>
-        <w:rPr>
-          <w:b/>
-          <w:bCs/>
-        </w:rPr>
-        <w:t xml:space="preserve"> Sex Change</w:t>
-      </w:r>
-    </w:p>
-    <w:p>
-      <w:r>
-        <w:tab/>
-      </w:r>
-      <w:commentRangeStart w:id="8"/>
-      <w:commentRangeStart w:id="9"/>
-      <w:r>
-        <w:t xml:space="preserve">Several transcription factors associated with </w:t>
-      </w:r>
-      <w:r>
-        <w:t>neurodevelopment and</w:t>
-      </w:r>
-      <w:r>
-        <w:t xml:space="preserve"> neurogenesis were found to be </w:t>
-      </w:r>
-      <w:r>
-        <w:t>DEG</w:t>
-      </w:r>
-      <w:r>
-        <w:t xml:space="preserve">s in radial glia. </w:t>
-      </w:r>
-      <w:r>
-        <w:t xml:space="preserve">Specifically, we found that in males and intermediates, </w:t>
-      </w:r>
-      <w:r>
-        <w:t xml:space="preserve">expression of </w:t>
-      </w:r>
-      <w:r>
-        <w:rPr>
-          <w:i/>
-          <w:iCs/>
-        </w:rPr>
-        <w:t xml:space="preserve">gli1, pbnox2 </w:t>
-      </w:r>
-      <w:r>
-        <w:t>(</w:t>
-      </w:r>
-      <w:r>
-        <w:rPr>
-          <w:i/>
-          <w:iCs/>
-        </w:rPr>
-        <w:t>LOC111568198</w:t>
-      </w:r>
-      <w:r>
-        <w:t xml:space="preserve">), and </w:t>
-      </w:r>
-      <w:r>
-        <w:t>COUP-TFII (</w:t>
-      </w:r>
-      <w:r>
-        <w:rPr>
-          <w:i/>
-          <w:iCs/>
-        </w:rPr>
-        <w:t>LOC111563338</w:t>
-      </w:r>
-      <w:r>
-        <w:rPr>
-          <w:i/>
-          <w:iCs/>
-        </w:rPr>
-        <w:t>)</w:t>
-      </w:r>
-      <w:r>
-        <w:rPr>
-          <w:i/>
-          <w:iCs/>
-        </w:rPr>
-        <w:t xml:space="preserve"> </w:t>
-      </w:r>
-      <w:r>
-        <w:t xml:space="preserve">was </w:t>
-      </w:r>
-      <w:r>
-        <w:t>increased</w:t>
-      </w:r>
-      <w:r>
-        <w:t xml:space="preserve"> suggesting radial are in a proliferative (primed?) state (</w:t>
-      </w:r>
-      <w:r>
-        <w:rPr>
-          <w:highlight w:val="yellow"/>
-        </w:rPr>
-        <w:t>CITATION</w:t>
-      </w:r>
-      <w:r>
-        <w:t xml:space="preserve">S). In intermediates however, there was additionally increased expression of </w:t>
-      </w:r>
-      <w:commentRangeStart w:id="10"/>
-      <w:r>
-        <w:rPr>
-          <w:i/>
-          <w:iCs/>
-        </w:rPr>
-        <w:t>dbx1</w:t>
-      </w:r>
-      <w:commentRangeEnd w:id="10"/>
-      <w:r>
-        <w:rPr>
-          <w:rStyle w:val="CommentReference"/>
-        </w:rPr>
-        <w:commentReference w:id="10"/>
-      </w:r>
-      <w:r>
-        <w:rPr>
-          <w:i/>
-          <w:iCs/>
-        </w:rPr>
-        <w:t xml:space="preserve">-bl </w:t>
-      </w:r>
-      <w:r>
-        <w:t>(</w:t>
-      </w:r>
-      <w:r>
-        <w:rPr>
-          <w:i/>
-          <w:iCs/>
-        </w:rPr>
-        <w:t>LOC111587547</w:t>
-      </w:r>
-      <w:r>
-        <w:t xml:space="preserve">) and </w:t>
-      </w:r>
-      <w:r>
-        <w:rPr>
-          <w:i/>
-          <w:iCs/>
-        </w:rPr>
-        <w:t>znf710b</w:t>
-      </w:r>
-      <w:r>
-        <w:rPr>
-          <w:i/>
-          <w:iCs/>
-        </w:rPr>
-        <w:t xml:space="preserve">, </w:t>
-      </w:r>
-      <w:r>
-        <w:t>two markers of commitment to differentiation (</w:t>
-      </w:r>
-      <w:r>
-        <w:rPr>
-          <w:highlight w:val="yellow"/>
-        </w:rPr>
-        <w:t>CITATION</w:t>
-      </w:r>
-      <w:r>
-        <w:t xml:space="preserve">S). This transcription factor complement suggests that the radial glia of intermediates </w:t>
-      </w:r>
-      <w:proofErr w:type="gramStart"/>
-      <w:r>
-        <w:t>are</w:t>
-      </w:r>
-      <w:proofErr w:type="gramEnd"/>
-      <w:r>
-        <w:t xml:space="preserve"> transitioning from a progenitor state to a proliferating state. Females, however, were marked by expression of </w:t>
-      </w:r>
-      <w:r>
-        <w:rPr>
-          <w:i/>
-          <w:iCs/>
-        </w:rPr>
-        <w:t>sox6</w:t>
-      </w:r>
-      <w:r>
-        <w:t xml:space="preserve">, </w:t>
-      </w:r>
-      <w:r>
-        <w:rPr>
-          <w:i/>
-          <w:iCs/>
-        </w:rPr>
-        <w:t xml:space="preserve">nkx2.2a, </w:t>
-      </w:r>
-      <w:r>
-        <w:t xml:space="preserve">and </w:t>
-      </w:r>
-      <w:r>
-        <w:rPr>
-          <w:i/>
-          <w:iCs/>
-        </w:rPr>
-        <w:t>foxp2</w:t>
-      </w:r>
-      <w:r>
-        <w:t>, suggesting differentiation into GABAergic neurons (</w:t>
-      </w:r>
-      <w:r>
-        <w:rPr>
-          <w:highlight w:val="yellow"/>
-        </w:rPr>
-        <w:t>CITATIONS</w:t>
-      </w:r>
-      <w:r>
-        <w:t>) (</w:t>
-      </w:r>
-      <w:r>
-        <w:rPr>
-          <w:highlight w:val="yellow"/>
-        </w:rPr>
-        <w:t>Figure</w:t>
-      </w:r>
-      <w:r>
-        <w:t xml:space="preserve">). </w:t>
-      </w:r>
-      <w:commentRangeEnd w:id="8"/>
-      <w:r>
-        <w:rPr>
-          <w:rStyle w:val="CommentReference"/>
-        </w:rPr>
-        <w:commentReference w:id="8"/>
-      </w:r>
-      <w:commentRangeEnd w:id="9"/>
-      <w:r>
-        <w:rPr>
-          <w:rStyle w:val="CommentReference"/>
-        </w:rPr>
-        <w:commentReference w:id="9"/>
-      </w:r>
-    </w:p>
-    <w:p>
-      <w:pPr>
-        <w:rPr>
-          <w:b/>
-          <w:bCs/>
-        </w:rPr>
-      </w:pPr>
-      <w:r>
-        <w:rPr>
-          <w:b/>
-          <w:bCs/>
-          <w:highlight w:val="yellow"/>
-        </w:rPr>
-        <w:t xml:space="preserve">Radial Glia </w:t>
-      </w:r>
-      <w:proofErr w:type="spellStart"/>
-      <w:r>
-        <w:rPr>
-          <w:b/>
-          <w:bCs/>
-          <w:highlight w:val="yellow"/>
-        </w:rPr>
-        <w:t>subclustering</w:t>
-      </w:r>
-      <w:proofErr w:type="spellEnd"/>
-      <w:r>
-        <w:rPr>
-          <w:b/>
-          <w:bCs/>
-          <w:highlight w:val="yellow"/>
-        </w:rPr>
-        <w:t>…</w:t>
-      </w:r>
-      <w:commentRangeStart w:id="11"/>
-    </w:p>
-    <w:p>
-      <w:r>
-        <w:tab/>
-        <w:t xml:space="preserve">To gain a deeper understanding of the changes occurring in the radial glia, we next subclustered radial glia </w:t>
-      </w:r>
-      <w:proofErr w:type="gramStart"/>
-      <w:r>
-        <w:t>in to</w:t>
-      </w:r>
-      <w:proofErr w:type="gramEnd"/>
-      <w:r>
-        <w:t xml:space="preserve"> 6 subclusters referred to as 1_0 – 1_5 (</w:t>
-      </w:r>
-      <w:r>
-        <w:rPr>
-          <w:highlight w:val="yellow"/>
-        </w:rPr>
-        <w:t>see methods</w:t>
-      </w:r>
-      <w:r>
-        <w:t>). Using CytoTRACE</w:t>
+      <w:r>
+        <w:t>Taken together, this gene expression profile suggests 6_1 is a cell type homologous to the arcuate nucleus of the hypothalamus (ARC)</w:t>
       </w:r>
       <w:r>
         <w:fldChar w:fldCharType="begin"/>
       </w:r>
       <w:r>
-        <w:instrText xml:space="preserve"> ADDIN ZOTERO_ITEM CSL_CITATION {"citationID":"jh0PC5gC","properties":{"formattedCitation":"\\super 13\\nosupersub{}","plainCitation":"13","noteIndex":0},"citationItems":[{"id":3274,"uris":["http://zotero.org/users/11313215/items/LEWHIU9W"],"itemData":{"id":3274,"type":"article-journal","abstract":"Single-cell RNA sequencing (scRNA-seq) is a powerful approach for reconstructing cellular differentiation trajectories. However, inferring both the state and direction of differentiation is challenging. Here, we demonstrate a simple, yet robust, determinant of developmental potential—the number of expressed genes per cell—and leverage this measure of transcriptional diversity to develop a computational framework (CytoTRACE) for predicting differentiation states from scRNA-seq data. When applied to diverse tissue types and organisms, CytoTRACE outperformed previous methods and nearly 19,000 annotated gene sets for resolving 52 experimentally determined developmental trajectories. Additionally, it facilitated the identification of quiescent stem cells and revealed genes that contribute to breast tumorigenesis. This study thus establishes a key RNA-based feature of developmental potential and a platform for delineation of cellular hierarchies.","container-title":"Science","DOI":"10.1126/science.aax0249","issue":"6476","note":"publisher: American Association for the Advancement of Science","page":"405-411","source":"science.org (Atypon)","title":"Single-cell transcriptional diversity is a hallmark of developmental potential","volume":"367","author":[{"family":"Gulati","given":"Gunsagar S."},{"family":"Sikandar","given":"Shaheen S."},{"family":"Wesche","given":"Daniel J."},{"family":"Manjunath","given":"Anoop"},{"family":"Bharadwaj","given":"Anjan"},{"family":"Berger","given":"Mark J."},{"family":"Ilagan","given":"Francisco"},{"family":"Kuo","given":"Angera H."},{"family":"Hsieh","given":"Robert W."},{"family":"Cai","given":"Shang"},{"family":"Zabala","given":"Maider"},{"family":"Scheeren","given":"Ferenc A."},{"family":"Lobo","given":"Neethan A."},{"family":"Qian","given":"Dalong"},{"family":"Yu","given":"Feiqiao B."},{"family":"Dirbas","given":"Frederick M."},{"family":"Clarke","given":"Michael F."},{"family":"Newman","given":"Aaron M."}],"issued":{"date-parts":[["2020",1,24]]}}}],"schema":"https://github.com/citation-style-language/schema/raw/master/csl-citation.json"} </w:instrText>
+        <w:instrText xml:space="preserve"> ADDIN ZOTERO_ITEM CSL_CITATION {"citationID":"yjL9fTP6","properties":{"formattedCitation":"\\super 7,8\\nosupersub{}","plainCitation":"7,8","noteIndex":0},"citationItems":[{"id":5502,"uris":["http://zotero.org/users/11313215/items/PEMB8LNT"],"itemData":{"id":5502,"type":"article-journal","abstract":"Owing to its complex structure and highly diverse cell populations, the study of hypothalamic development has historically lagged behind that of other brain regions. However, in recent years, a greatly expanded understanding of hypothalamic gene expression during development has opened up new avenues of investigation. In this review, we synthesize existing work to present a holistic picture of hypothalamic development from early induction and patterning through nuclear specification and differentiation, with a particular emphasis on determination of cell fate. We will also touch on special topics in the field including the prosomere model, adult neurogenesis, and integration of migratory cells originating outside the hypothalamic neuroepithelium, and how these topics relate to our broader theme. WIREs Dev Biol 2015, 4:445–468. doi: 10.1002/wdev.187 This article is categorized under: Nervous System Development &gt; Vertebrates: General Principles","container-title":"WIREs Developmental Biology","DOI":"10.1002/wdev.187","ISSN":"1759-7692","issue":"5","language":"en","note":"_eprint: https://wires.onlinelibrary.wiley.com/doi/pdf/10.1002/wdev.187","page":"445-468","source":"Wiley Online Library","title":"Patterning, specification, and differentiation in the developing hypothalamus","volume":"4","author":[{"family":"Bedont","given":"Joseph L."},{"family":"Newman","given":"Elizabeth A."},{"family":"Blackshaw","given":"Seth"}],"issued":{"date-parts":[["2015"]]}}},{"id":5479,"uris":["http://zotero.org/users/11313215/items/SCF5RD7Z"],"itemData":{"id":5479,"type":"article-journal","abstract":"The hypothalamus, which regulates fundamental aspects of physiological homeostasis and behavior, is a brain region that exhibits highly conserved anatomy across vertebrate species. Its development involves conserved basic mechanisms of induction and patterning, combined with a more plastic process of neuronal fate specification, to produce brain circuits that mediate physiology and behavior according to the needs of each species. Here, we review the factors involved in the induction, patterning and neuronal differentiation of the hypothalamus, highlighting recent evidence that illustrates how changes in Wnt/β-catenin signaling during development may lead to species-specific form and function of this important brain structure., Summary: This Review discusses the factors involved in hypothalamic induction, patterning and differentiation, highlighting how changes in Wnt signaling may lead to species-specific hypothalamic form and function.","container-title":"Development (Cambridge, England)","DOI":"10.1242/dev.139055","ISSN":"0950-1991","issue":"9","journalAbbreviation":"Development","note":"PMID: 28465334\nPMCID: PMC5450842","page":"1588-1599","source":"PubMed Central","title":"Development of the hypothalamus: conservation, modification and innovation","title-short":"Development of the hypothalamus","volume":"144","author":[{"family":"Xie","given":"Yuanyuan"},{"family":"Dorsky","given":"Richard I."}],"issued":{"date-parts":[["2017",5,1]]}}}],"schema":"https://github.com/citation-style-language/schema/raw/master/csl-citation.json"} </w:instrText>
       </w:r>
       <w:r>
         <w:fldChar w:fldCharType="separate"/>
@@ -1856,51 +2565,57 @@
           <w:szCs w:val="24"/>
           <w:vertAlign w:val="superscript"/>
         </w:rPr>
-        <w:t>13</w:t>
+        <w:t>7,8</w:t>
       </w:r>
       <w:r>
         <w:fldChar w:fldCharType="end"/>
       </w:r>
       <w:r>
-        <w:t>, we found that subclusters 1_1 and 1_3 represented immature populations while the rest were mature to various extents (f</w:t>
-      </w:r>
-      <w:r>
-        <w:rPr>
-          <w:highlight w:val="yellow"/>
-        </w:rPr>
-        <w:t>igure</w:t>
-      </w:r>
-      <w:r>
-        <w:t xml:space="preserve">). To further classify these clusters, we next examined their marker genes. </w:t>
-      </w:r>
-      <w:r>
-        <w:t xml:space="preserve">We identified subclusters </w:t>
-      </w:r>
-      <w:r>
-        <w:t xml:space="preserve">1_1 and </w:t>
-      </w:r>
-      <w:r>
-        <w:t>1_</w:t>
-      </w:r>
-      <w:r>
-        <w:t>3</w:t>
-      </w:r>
-      <w:r>
-        <w:t xml:space="preserve"> as </w:t>
-      </w:r>
-      <w:r>
-        <w:t>quiescent</w:t>
-      </w:r>
-      <w:r>
-        <w:t xml:space="preserve"> based on expression of </w:t>
-      </w:r>
-      <w:r>
-        <w:rPr>
-          <w:i/>
-          <w:iCs/>
-        </w:rPr>
-        <w:t>setd1a</w:t>
-      </w:r>
+        <w:t>.</w:t>
+      </w:r>
+      <w:r>
+        <w:rPr>
+          <w:i/>
+          <w:iCs/>
+        </w:rPr>
+        <w:t xml:space="preserve"> </w:t>
+      </w:r>
+      <w:r>
+        <w:t xml:space="preserve">We therefore refer to this cluster as </w:t>
+      </w:r>
+      <w:r>
+        <w:t>6_</w:t>
+      </w:r>
+      <w:r>
+        <w:t>ARC.</w:t>
+      </w:r>
+      <w:commentRangeEnd w:id="16"/>
+      <w:r>
+        <w:rPr>
+          <w:rStyle w:val="CommentReference"/>
+        </w:rPr>
+        <w:commentReference w:id="16"/>
+      </w:r>
+    </w:p>
+    <w:p>
+      <w:pPr>
+        <w:ind w:firstLine="720"/>
+      </w:pPr>
+      <w:r>
+        <w:t>Cluster 6_2 expressed all of the canonical NPO markers including</w:t>
+      </w:r>
+      <w:r>
+        <w:t xml:space="preserve"> the transcription factors </w:t>
+      </w:r>
+      <w:proofErr w:type="spellStart"/>
+      <w:r>
+        <w:rPr>
+          <w:i/>
+          <w:iCs/>
+        </w:rPr>
+        <w:t>otpa</w:t>
+      </w:r>
+      <w:proofErr w:type="spellEnd"/>
       <w:r>
         <w:rPr>
           <w:i/>
@@ -1908,37 +2623,21 @@
         </w:rPr>
         <w:t xml:space="preserve">, </w:t>
       </w:r>
-      <w:r>
-        <w:t xml:space="preserve">increased expression of </w:t>
-      </w:r>
       <w:proofErr w:type="spellStart"/>
       <w:r>
         <w:rPr>
           <w:i/>
           <w:iCs/>
         </w:rPr>
-        <w:t>glula</w:t>
+        <w:t>otpbl</w:t>
       </w:r>
       <w:proofErr w:type="spellEnd"/>
       <w:r>
-        <w:t xml:space="preserve"> (</w:t>
-      </w:r>
-      <w:r>
-        <w:rPr>
-          <w:i/>
-          <w:iCs/>
-        </w:rPr>
-        <w:t>LOC111570141</w:t>
-      </w:r>
-      <w:r>
-        <w:t xml:space="preserve">), </w:t>
-      </w:r>
-      <w:r>
-        <w:rPr>
-          <w:i/>
-          <w:iCs/>
-        </w:rPr>
-        <w:t xml:space="preserve">fabp7b </w:t>
+        <w:rPr>
+          <w:i/>
+          <w:iCs/>
+        </w:rPr>
+        <w:t xml:space="preserve"> </w:t>
       </w:r>
       <w:r>
         <w:t>(</w:t>
@@ -1948,41 +2647,51 @@
           <w:i/>
           <w:iCs/>
         </w:rPr>
-        <w:t>LOC111575074</w:t>
-      </w:r>
-      <w:r>
-        <w:t>), and</w:t>
-      </w:r>
-      <w:r>
-        <w:rPr>
-          <w:i/>
-          <w:iCs/>
-        </w:rPr>
-        <w:t xml:space="preserve"> s100[beta], </w:t>
-      </w:r>
-      <w:r>
-        <w:t xml:space="preserve">and absence of </w:t>
-      </w:r>
-      <w:r>
-        <w:rPr>
-          <w:i/>
-          <w:iCs/>
-        </w:rPr>
-        <w:t xml:space="preserve">ccnd1 </w:t>
-      </w:r>
-      <w:r>
-        <w:t>(</w:t>
-      </w:r>
-      <w:r>
-        <w:rPr>
-          <w:highlight w:val="yellow"/>
-        </w:rPr>
-        <w:t>Figure</w:t>
+        <w:t>LOC111564688</w:t>
       </w:r>
       <w:r>
         <w:t>)</w:t>
       </w:r>
       <w:r>
+        <w:t xml:space="preserve">, </w:t>
+      </w:r>
+      <w:r>
+        <w:rPr>
+          <w:i/>
+          <w:iCs/>
+        </w:rPr>
+        <w:t xml:space="preserve">fezf2, </w:t>
+      </w:r>
+      <w:r>
+        <w:t xml:space="preserve">and </w:t>
+      </w:r>
+      <w:r>
+        <w:rPr>
+          <w:i/>
+          <w:iCs/>
+        </w:rPr>
+        <w:t xml:space="preserve">sim1a, </w:t>
+      </w:r>
+      <w:r>
+        <w:t xml:space="preserve">as well as the nonapeptides </w:t>
+      </w:r>
+      <w:proofErr w:type="spellStart"/>
+      <w:r>
+        <w:rPr>
+          <w:i/>
+          <w:iCs/>
+        </w:rPr>
+        <w:t>avp</w:t>
+      </w:r>
+      <w:proofErr w:type="spellEnd"/>
+      <w:r>
+        <w:rPr>
+          <w:i/>
+          <w:iCs/>
+        </w:rPr>
+        <w:t>,</w:t>
+      </w:r>
+      <w:r>
         <w:rPr>
           <w:i/>
           <w:iCs/>
@@ -1990,24 +2699,22 @@
         <w:t xml:space="preserve"> </w:t>
       </w:r>
       <w:r>
-        <w:rPr>
-          <w:i/>
-          <w:iCs/>
-        </w:rPr>
+        <w:t>and</w:t>
+      </w:r>
+      <w:r>
+        <w:rPr>
+          <w:i/>
+          <w:iCs/>
+        </w:rPr>
+        <w:t xml:space="preserve"> oxt</w:t>
+      </w:r>
+      <w:r>
         <w:fldChar w:fldCharType="begin"/>
       </w:r>
       <w:r>
-        <w:rPr>
-          <w:i/>
-          <w:iCs/>
-        </w:rPr>
-        <w:instrText xml:space="preserve"> ADDIN ZOTERO_ITEM CSL_CITATION {"citationID":"VPOE020t","properties":{"formattedCitation":"\\super 14,15\\nosupersub{}","plainCitation":"14,15","noteIndex":0},"citationItems":[{"id":5397,"uris":["http://zotero.org/users/11313215/items/4VXMT6UF"],"itemData":{"id":5397,"type":"article-journal","abstract":"Zebrafish display widespread and pronounced adult neurogenesis, which is fundamental for their regeneration capability after central nervous system injury. However, the cellular identity and the biological properties of adult newborn neurons are elusive for most brain areas. Here, we have used short-term lineage tracing of radial glia progeny to prospectively isolate newborn neurons from the her4.1+ radial glia lineage in the homeostatic adult forebrain. Transcriptome analysis of radial glia, newborn neurons and mature neurons using single cell sequencing identified distinct transcriptional profiles, including novel markers for each population. Specifically, we detected two separate newborn neuron types, which showed diversity of cell fate commitment and location. Further analyses showed that these cell types are homologous to neurogenic cells in the mammalian brain, identified neurogenic commitment in proliferating radial glia and indicated that glutamatergic projection neurons are generated in the adult zebrafish telencephalon. Thus, we prospectively isolated adult newborn neurons from the adult zebrafish forebrain, identified markers for newborn and mature neurons in the adult brain, and revealed intrinsic heterogeneity among adult newborn neurons and their homology with mammalian adult neurogenic cell types.","container-title":"Development","DOI":"10.1242/dev.185595","ISSN":"0950-1991","issue":"1","journalAbbreviation":"Development","page":"dev185595","source":"Silverchair","title":"Single cell sequencing of radial glia progeny reveals the diversity of newborn neurons in the adult zebrafish brain","volume":"147","author":[{"family":"Lange","given":"Christian"},{"family":"Rost","given":"Fabian"},{"family":"Machate","given":"Anja"},{"family":"Reinhardt","given":"Susanne"},{"family":"Lesche","given":"Matthias"},{"family":"Weber","given":"Anke"},{"family":"Kuscha","given":"Veronika"},{"family":"Dahl","given":"Andreas"},{"family":"Rulands","given":"Steffen"},{"family":"Brand","given":"Michael"}],"issued":{"date-parts":[["2020",1,9]]}}},{"id":5395,"uris":["http://zotero.org/users/11313215/items/VRUJWZFZ"],"itemData":{"id":5395,"type":"article-journal","abstract":"Quiescence, a hallmark of adult neural stem cells (NSCs), is required for maintaining the NSC pool to support life-long continuous neurogenesis in the adult dentate gyrus (DG). Whether long-lasting epigenetic modifications maintain NSC quiescence over the long term in the adult DG is not well-understood. Here we show that mice with haploinsufficiency of Setd1a, a schizophrenia risk gene encoding a histone H3K4 methyltransferase, develop an enlarged DG with more dentate granule cells after young adulthood. Deletion of Setd1a specifically in quiescent NSCs in the adult DG promotes their activation and neurogenesis, which is countered by inhibition of the histone demethylase LSD1. Mechanistically, RNA-sequencing and CUT &amp; RUN analyses of cultured quiescent adult NSCs reveal Setd1a deletion-induced transcriptional changes and many Setd1a targets, among which down-regulation of Bhlhe40 promotes quiescent NSC activation in the adult DG in vivo. Together, our study reveals a Setd1a-dependent epigenetic mechanism that sustains NSC quiescence in the adult DG.","container-title":"Nature Communications","DOI":"10.1038/s41467-024-50010-y","ISSN":"2041-1723","issue":"1","journalAbbreviation":"Nat Commun","language":"en","license":"2024 The Author(s)","note":"publisher: Nature Publishing Group","page":"5674","source":"www.nature.com","title":"Epigenetic maintenance of adult neural stem cell quiescence in the mouse hippocampus via Setd1a","volume":"15","author":[{"family":"Zhao","given":"Ting"},{"family":"Hong","given":"Yan"},{"family":"Yan","given":"Bowen"},{"family":"Huang","given":"Suming"},{"family":"Ming","given":"Guo-li"},{"family":"Song","given":"Hongjun"}],"issued":{"date-parts":[["2024",7,6]]}}}],"schema":"https://github.com/citation-style-language/schema/raw/master/csl-citation.json"} </w:instrText>
-      </w:r>
-      <w:r>
-        <w:rPr>
-          <w:i/>
-          <w:iCs/>
-        </w:rPr>
+        <w:instrText xml:space="preserve"> ADDIN ZOTERO_ITEM CSL_CITATION {"citationID":"nP8Kuhd9","properties":{"formattedCitation":"\\super 9,10\\nosupersub{}","plainCitation":"9,10","noteIndex":0},"citationItems":[{"id":5472,"uris":["http://zotero.org/users/11313215/items/GN7FM3HU"],"itemData":{"id":5472,"type":"article-journal","abstract":"The paraventricular nucleus (PVN) of the hypothalamus in mammals coordinates neuroendocrine, autonomic and behavioral responses pivotal for homeostasis and the stress response. A large amount of studies in rodents has documented that the PVN contains diverse neuronal cell types which can be identified by the expression of distinct secretory neuropeptides. Interestingly, PVN cell types often coexpress multiple neuropeptides whose relative coexpression level are subject to environment-induced plasticity.Due to their small size and transparency, zebrafish larvae offer the possibility to comprehensively study the development and plasticity of the PVN in large groups of intact animals, yet important anatomical information about the larval zebrafish PVN-homologous region has been missing. Therefore we recently defined the location and borders of the larval neurosecretory preoptic area (NPO) as the PVN-homologous region in larval zebrafish based on transcription factor expression and cell type clustering. To identify distinct cell types present in the larval NPO, we also generated a comprehensive 3D map of 9 zebrafish homologs of typical neuropeptides found in the mammalian PVN (arginine vasopressin, corticotropin-releasing hormone, proenkephalin a/b, neurotensin, oxytocin, vasoactive intestinal peptide, cholecystokinin, and somatostatin). Here we extend this chemoarchitectural map to include the degrees of coexpression of two neuropeptides in the same cell by performing systematic pairwise comparisons. Our results allowed the subclassification of NPO cell types, and differences in variability of coexpression profiles suggest potential targets of biochemical plasticity. Thus, this work provides an important basis for the analysis of the development, function, and plasticity of the primary neuroendocrine brain region in larval zebrafish.","container-title":"Frontiers in Neuroanatomy","DOI":"10.3389/fnana.2015.00002","ISSN":"1662-5129","journalAbbreviation":"Front. Neuroanat.","language":"English","note":"publisher: Frontiers","source":"Frontiers","title":"Coexpression analysis of nine neuropeptides in the neurosecretory preoptic area of larval zebrafish","URL":"https://www.frontiersin.org/journals/neuroanatomy/articles/10.3389/fnana.2015.00002/full","volume":"9","author":[{"family":"Herget","given":"Ulrich"},{"family":"Ryu","given":"Soojin"}],"accessed":{"date-parts":[["2026",1,29]]},"issued":{"date-parts":[["2015",2,12]]}}},{"id":5460,"uris":["http://zotero.org/users/11313215/items/T6MQRQIF"],"itemData":{"id":5460,"type":"article-journal","abstract":"The homeodomain transcription factor Orthopedia (Otp) is an important regulator for specification of defined subsets of neuroendocrine cells and dopaminergic neurons in vertebrates. In zebrafish, two paralogous otp genes, otpa and otpb, are present in the genome. Neither complete loss of Otp activity nor differential contributions of Otpa and Otpb to specification of defined neuronal populations have been analyzed in detail. We characterized zebrafish embryos and early larvae mutant for null alleles of otpa, otpb, or both genes to determine their individual contributions to the specification of th expressing dopaminergic neuronal populations as well as of crh, oxt, avp, trh or sst1.1 expressing neuroendocrine cells. otpa mutant larvae show an almost complete reduction of ventral diencephalic dopaminergic neurons, as reported previously. A small reduction in the number of trh cells in the preoptic region is detectable in otpa mutants, but no significant loss of crh, oxt and avp preoptic neuroendocrine cells. otpb single mutant larvae do not display a reduction in dopaminergic neurons or neuroendocrine cells in the otp expressing regions. In contrast, in otpa and otpb double mutant larvae specific groups of dopaminergic neurons as well as of crh, oxt, avp, trh and sst1.1-expressing neuroendocrine cells are completely lost. These observations suggest that the requirement for otpa and otpb function during development of the larval diencephalon is partially redundant. During evolutionary diversification of the paralogous otp genes, otpa maintained the prominent role in ventral diencephalic dopaminergic and neuroendocrine cell specification and is capable of partially compensating otpb loss of function. In addition, we identified a role of Otp in the development of a domain of somatostatin1-expressing cells in the rostral hindbrain, a region with strong otp expression but so far uncharacterized Otp function. Otp may thus be crucial for defined neuronal cell types also in the hindbrain.","container-title":"PLOS ONE","DOI":"10.1371/journal.pone.0075002","ISSN":"1932-6203","issue":"9","journalAbbreviation":"PLOS ONE","language":"en","note":"publisher: Public Library of Science","page":"e75002","source":"PLoS Journals","title":"Orthopedia Transcription Factor otpa and otpb Paralogous Genes Function during Dopaminergic and Neuroendocrine Cell Specification in Larval Zebrafish","volume":"8","author":[{"family":"Fernandes","given":"António M."},{"family":"Beddows","given":"Erin"},{"family":"Filippi","given":"Alida"},{"family":"Driever","given":"Wolfgang"}],"issued":{"date-parts":[["2013",9,20]]}}}],"schema":"https://github.com/citation-style-language/schema/raw/master/csl-citation.json"} </w:instrText>
+      </w:r>
+      <w:r>
         <w:fldChar w:fldCharType="separate"/>
       </w:r>
       <w:r>
@@ -2018,6 +2725,808 @@
           <w:szCs w:val="24"/>
           <w:vertAlign w:val="superscript"/>
         </w:rPr>
+        <w:t>9,10</w:t>
+      </w:r>
+      <w:r>
+        <w:fldChar w:fldCharType="end"/>
+      </w:r>
+      <w:r>
+        <w:t xml:space="preserve">. Thus, we hereafter refer to this this cluster as </w:t>
+      </w:r>
+      <w:r>
+        <w:t>6_</w:t>
+      </w:r>
+      <w:r>
+        <w:t xml:space="preserve">NPO. </w:t>
+      </w:r>
+    </w:p>
+    <w:p>
+      <w:pPr>
+        <w:ind w:firstLine="720"/>
+        <w:rPr>
+          <w:i/>
+          <w:iCs/>
+        </w:rPr>
+      </w:pPr>
+      <w:commentRangeStart w:id="18"/>
+      <w:commentRangeStart w:id="19"/>
+      <w:r>
+        <w:t xml:space="preserve">Interestingly, 6_NPO and 6_ARC strongly expressed the immediate early genes (IEGs) </w:t>
+      </w:r>
+      <w:proofErr w:type="spellStart"/>
+      <w:r>
+        <w:rPr>
+          <w:i/>
+          <w:iCs/>
+        </w:rPr>
+        <w:t>fosb</w:t>
+      </w:r>
+      <w:proofErr w:type="spellEnd"/>
+      <w:r>
+        <w:t xml:space="preserve">, </w:t>
+      </w:r>
+      <w:r>
+        <w:rPr>
+          <w:i/>
+          <w:iCs/>
+        </w:rPr>
+        <w:t xml:space="preserve">egr1, </w:t>
+      </w:r>
+      <w:r>
+        <w:t xml:space="preserve">and </w:t>
+      </w:r>
+      <w:r>
+        <w:rPr>
+          <w:i/>
+          <w:iCs/>
+        </w:rPr>
+        <w:t xml:space="preserve">npas4a </w:t>
+      </w:r>
+      <w:r>
+        <w:t>(Fig. 3b)</w:t>
+      </w:r>
+      <w:r>
+        <w:rPr>
+          <w:i/>
+          <w:iCs/>
+        </w:rPr>
+        <w:t>.</w:t>
+      </w:r>
+      <w:commentRangeEnd w:id="18"/>
+      <w:r>
+        <w:rPr>
+          <w:rStyle w:val="CommentReference"/>
+        </w:rPr>
+        <w:commentReference w:id="18"/>
+      </w:r>
+      <w:commentRangeEnd w:id="19"/>
+      <w:r>
+        <w:rPr>
+          <w:rStyle w:val="CommentReference"/>
+        </w:rPr>
+        <w:commentReference w:id="19"/>
+      </w:r>
+    </w:p>
+    <w:p>
+      <w:pPr>
+        <w:ind w:firstLine="720"/>
+      </w:pPr>
+      <w:r>
+        <w:t xml:space="preserve">Cluster 6_3 was the only cell type in our dataset to express </w:t>
+      </w:r>
+      <w:r>
+        <w:rPr>
+          <w:i/>
+          <w:iCs/>
+        </w:rPr>
+        <w:t>gnrh1 (</w:t>
+      </w:r>
+      <w:r>
+        <w:rPr>
+          <w:i/>
+          <w:iCs/>
+        </w:rPr>
+        <w:t>LOC111571064</w:t>
+      </w:r>
+      <w:r>
+        <w:rPr>
+          <w:i/>
+          <w:iCs/>
+        </w:rPr>
+        <w:t>)</w:t>
+      </w:r>
+      <w:r>
+        <w:t xml:space="preserve">, it was marked by </w:t>
+      </w:r>
+      <w:r>
+        <w:t xml:space="preserve">the transcription factors </w:t>
+      </w:r>
+      <w:r>
+        <w:rPr>
+          <w:i/>
+          <w:iCs/>
+        </w:rPr>
+        <w:t>six6a</w:t>
+      </w:r>
+      <w:r>
+        <w:rPr>
+          <w:i/>
+          <w:iCs/>
+        </w:rPr>
+        <w:t xml:space="preserve"> </w:t>
+      </w:r>
+      <w:r>
+        <w:t>and</w:t>
+      </w:r>
+      <w:r>
+        <w:rPr>
+          <w:i/>
+          <w:iCs/>
+        </w:rPr>
+        <w:t xml:space="preserve"> </w:t>
+      </w:r>
+      <w:proofErr w:type="spellStart"/>
+      <w:r>
+        <w:rPr>
+          <w:i/>
+          <w:iCs/>
+        </w:rPr>
+        <w:t>roraa</w:t>
+      </w:r>
+      <w:proofErr w:type="spellEnd"/>
+      <w:r>
+        <w:rPr>
+          <w:i/>
+          <w:iCs/>
+        </w:rPr>
+        <w:t>,</w:t>
+      </w:r>
+      <w:r>
+        <w:rPr>
+          <w:i/>
+          <w:iCs/>
+        </w:rPr>
+        <w:t xml:space="preserve"> </w:t>
+      </w:r>
+      <w:r>
+        <w:t>and expressed</w:t>
+      </w:r>
+      <w:r>
+        <w:rPr>
+          <w:i/>
+          <w:iCs/>
+        </w:rPr>
+        <w:t xml:space="preserve"> </w:t>
+      </w:r>
+      <w:proofErr w:type="spellStart"/>
+      <w:r>
+        <w:rPr>
+          <w:i/>
+          <w:iCs/>
+        </w:rPr>
+        <w:t>cckbrb</w:t>
+      </w:r>
+      <w:proofErr w:type="spellEnd"/>
+      <w:r>
+        <w:rPr>
+          <w:i/>
+          <w:iCs/>
+        </w:rPr>
+        <w:t xml:space="preserve">, </w:t>
+      </w:r>
+      <w:proofErr w:type="spellStart"/>
+      <w:r>
+        <w:rPr>
+          <w:i/>
+          <w:iCs/>
+        </w:rPr>
+        <w:t>penka</w:t>
+      </w:r>
+      <w:proofErr w:type="spellEnd"/>
+      <w:r>
+        <w:rPr>
+          <w:i/>
+          <w:iCs/>
+        </w:rPr>
+        <w:t xml:space="preserve">, </w:t>
+      </w:r>
+      <w:proofErr w:type="gramStart"/>
+      <w:r>
+        <w:t>and,</w:t>
+      </w:r>
+      <w:proofErr w:type="gramEnd"/>
+      <w:r>
+        <w:t xml:space="preserve"> </w:t>
+      </w:r>
+      <w:proofErr w:type="spellStart"/>
+      <w:r>
+        <w:rPr>
+          <w:i/>
+          <w:iCs/>
+        </w:rPr>
+        <w:t>crhb</w:t>
+      </w:r>
+      <w:proofErr w:type="spellEnd"/>
+      <w:r>
+        <w:rPr>
+          <w:i/>
+          <w:iCs/>
+        </w:rPr>
+        <w:t xml:space="preserve">. </w:t>
+      </w:r>
+      <w:r>
+        <w:t xml:space="preserve">We </w:t>
+      </w:r>
+      <w:r>
+        <w:t>therefore</w:t>
+      </w:r>
+      <w:r>
+        <w:t xml:space="preserve"> refer to this cluster as </w:t>
+      </w:r>
+      <w:r>
+        <w:t>6_Hypophysiotrophic (6_HPT).</w:t>
+      </w:r>
+    </w:p>
+    <w:p>
+      <w:pPr>
+        <w:ind w:firstLine="720"/>
+      </w:pPr>
+    </w:p>
+    <w:p>
+      <w:pPr>
+        <w:rPr>
+          <w:b/>
+          <w:bCs/>
+        </w:rPr>
+      </w:pPr>
+      <w:r>
+        <w:rPr>
+          <w:b/>
+          <w:bCs/>
+        </w:rPr>
+        <w:t xml:space="preserve">[Cluster 6] Undergoes Changes </w:t>
+      </w:r>
+      <w:proofErr w:type="gramStart"/>
+      <w:r>
+        <w:rPr>
+          <w:b/>
+          <w:bCs/>
+        </w:rPr>
+        <w:t>In</w:t>
+      </w:r>
+      <w:proofErr w:type="gramEnd"/>
+      <w:r>
+        <w:rPr>
+          <w:b/>
+          <w:bCs/>
+        </w:rPr>
+        <w:t xml:space="preserve"> </w:t>
+      </w:r>
+      <w:r>
+        <w:rPr>
+          <w:b/>
+          <w:bCs/>
+        </w:rPr>
+        <w:t>S</w:t>
+      </w:r>
+      <w:r>
+        <w:rPr>
+          <w:b/>
+          <w:bCs/>
+        </w:rPr>
+        <w:t>ubcluster Proportion During Sex Chage</w:t>
+      </w:r>
+    </w:p>
+    <w:p>
+      <w:r>
+        <w:tab/>
+      </w:r>
+      <w:r>
+        <w:t>….</w:t>
+      </w:r>
+    </w:p>
+    <w:p>
+      <w:r>
+        <w:rPr>
+          <w:b/>
+          <w:bCs/>
+        </w:rPr>
+        <w:t>[</w:t>
+      </w:r>
+    </w:p>
+    <w:p/>
+    <w:p>
+      <w:pPr>
+        <w:rPr>
+          <w:b/>
+          <w:bCs/>
+        </w:rPr>
+      </w:pPr>
+      <w:r>
+        <w:rPr>
+          <w:b/>
+          <w:bCs/>
+        </w:rPr>
+        <w:lastRenderedPageBreak/>
+        <w:t xml:space="preserve">Radial Glia Undergo </w:t>
+      </w:r>
+      <w:r>
+        <w:rPr>
+          <w:b/>
+          <w:bCs/>
+        </w:rPr>
+        <w:t xml:space="preserve">Developmental-Like Transcription Factor Transitions </w:t>
+      </w:r>
+      <w:r>
+        <w:rPr>
+          <w:b/>
+          <w:bCs/>
+        </w:rPr>
+        <w:t>During</w:t>
+      </w:r>
+      <w:r>
+        <w:rPr>
+          <w:b/>
+          <w:bCs/>
+        </w:rPr>
+        <w:t xml:space="preserve"> Sex Change</w:t>
+      </w:r>
+    </w:p>
+    <w:p>
+      <w:r>
+        <w:tab/>
+      </w:r>
+      <w:commentRangeStart w:id="20"/>
+      <w:commentRangeStart w:id="21"/>
+      <w:r>
+        <w:t xml:space="preserve">Several transcription factors associated with </w:t>
+      </w:r>
+      <w:r>
+        <w:t>neurodevelopment and</w:t>
+      </w:r>
+      <w:r>
+        <w:t xml:space="preserve"> neurogenesis were found to be </w:t>
+      </w:r>
+      <w:r>
+        <w:t>DEG</w:t>
+      </w:r>
+      <w:r>
+        <w:t xml:space="preserve">s in radial glia. </w:t>
+      </w:r>
+      <w:r>
+        <w:t xml:space="preserve">Specifically, we found that in males and intermediates, </w:t>
+      </w:r>
+      <w:r>
+        <w:t xml:space="preserve">expression of </w:t>
+      </w:r>
+      <w:r>
+        <w:rPr>
+          <w:i/>
+          <w:iCs/>
+        </w:rPr>
+        <w:t xml:space="preserve">gli1, pbnox2 </w:t>
+      </w:r>
+      <w:r>
+        <w:t>(</w:t>
+      </w:r>
+      <w:r>
+        <w:rPr>
+          <w:i/>
+          <w:iCs/>
+        </w:rPr>
+        <w:t>LOC111568198</w:t>
+      </w:r>
+      <w:r>
+        <w:t xml:space="preserve">), and </w:t>
+      </w:r>
+      <w:r>
+        <w:t>COUP-TFII (</w:t>
+      </w:r>
+      <w:r>
+        <w:rPr>
+          <w:i/>
+          <w:iCs/>
+        </w:rPr>
+        <w:t>LOC111563338</w:t>
+      </w:r>
+      <w:r>
+        <w:rPr>
+          <w:i/>
+          <w:iCs/>
+        </w:rPr>
+        <w:t>)</w:t>
+      </w:r>
+      <w:r>
+        <w:rPr>
+          <w:i/>
+          <w:iCs/>
+        </w:rPr>
+        <w:t xml:space="preserve"> </w:t>
+      </w:r>
+      <w:r>
+        <w:t xml:space="preserve">was </w:t>
+      </w:r>
+      <w:r>
+        <w:t>increased</w:t>
+      </w:r>
+      <w:r>
+        <w:t xml:space="preserve"> suggesting radial are in a proliferative (primed?) state (</w:t>
+      </w:r>
+      <w:r>
+        <w:rPr>
+          <w:highlight w:val="yellow"/>
+        </w:rPr>
+        <w:t>CITATION</w:t>
+      </w:r>
+      <w:r>
+        <w:t xml:space="preserve">S). In intermediates however, there was additionally increased expression of </w:t>
+      </w:r>
+      <w:commentRangeStart w:id="22"/>
+      <w:r>
+        <w:rPr>
+          <w:i/>
+          <w:iCs/>
+        </w:rPr>
+        <w:t>dbx1</w:t>
+      </w:r>
+      <w:commentRangeEnd w:id="22"/>
+      <w:r>
+        <w:rPr>
+          <w:rStyle w:val="CommentReference"/>
+        </w:rPr>
+        <w:commentReference w:id="22"/>
+      </w:r>
+      <w:r>
+        <w:rPr>
+          <w:i/>
+          <w:iCs/>
+        </w:rPr>
+        <w:t xml:space="preserve">-bl </w:t>
+      </w:r>
+      <w:r>
+        <w:t>(</w:t>
+      </w:r>
+      <w:r>
+        <w:rPr>
+          <w:i/>
+          <w:iCs/>
+        </w:rPr>
+        <w:t>LOC111587547</w:t>
+      </w:r>
+      <w:r>
+        <w:t xml:space="preserve">) and </w:t>
+      </w:r>
+      <w:r>
+        <w:rPr>
+          <w:i/>
+          <w:iCs/>
+        </w:rPr>
+        <w:t>znf710b</w:t>
+      </w:r>
+      <w:r>
+        <w:rPr>
+          <w:i/>
+          <w:iCs/>
+        </w:rPr>
+        <w:t xml:space="preserve">, </w:t>
+      </w:r>
+      <w:r>
+        <w:t>two markers of commitment to differentiation (</w:t>
+      </w:r>
+      <w:r>
+        <w:rPr>
+          <w:highlight w:val="yellow"/>
+        </w:rPr>
+        <w:t>CITATION</w:t>
+      </w:r>
+      <w:r>
+        <w:t xml:space="preserve">S). This transcription factor complement suggests that the radial glia of intermediates </w:t>
+      </w:r>
+      <w:r>
+        <w:t>transition</w:t>
+      </w:r>
+      <w:r>
+        <w:t xml:space="preserve"> from a progenitor state to a proliferating state. Females, however, were marked by expression of </w:t>
+      </w:r>
+      <w:r>
+        <w:rPr>
+          <w:i/>
+          <w:iCs/>
+        </w:rPr>
+        <w:t>sox6</w:t>
+      </w:r>
+      <w:r>
+        <w:t xml:space="preserve">, </w:t>
+      </w:r>
+      <w:r>
+        <w:rPr>
+          <w:i/>
+          <w:iCs/>
+        </w:rPr>
+        <w:t xml:space="preserve">nkx2.2a, </w:t>
+      </w:r>
+      <w:r>
+        <w:t xml:space="preserve">and </w:t>
+      </w:r>
+      <w:r>
+        <w:rPr>
+          <w:i/>
+          <w:iCs/>
+        </w:rPr>
+        <w:t>foxp2</w:t>
+      </w:r>
+      <w:r>
+        <w:t>, suggesting differentiation into GABAergic neurons (</w:t>
+      </w:r>
+      <w:r>
+        <w:rPr>
+          <w:highlight w:val="yellow"/>
+        </w:rPr>
+        <w:t>CITATIONS</w:t>
+      </w:r>
+      <w:r>
+        <w:t>) (</w:t>
+      </w:r>
+      <w:r>
+        <w:rPr>
+          <w:highlight w:val="yellow"/>
+        </w:rPr>
+        <w:t>Figure</w:t>
+      </w:r>
+      <w:r>
+        <w:t xml:space="preserve">). </w:t>
+      </w:r>
+      <w:commentRangeEnd w:id="20"/>
+      <w:r>
+        <w:rPr>
+          <w:rStyle w:val="CommentReference"/>
+        </w:rPr>
+        <w:commentReference w:id="20"/>
+      </w:r>
+      <w:commentRangeEnd w:id="21"/>
+      <w:r>
+        <w:rPr>
+          <w:rStyle w:val="CommentReference"/>
+        </w:rPr>
+        <w:commentReference w:id="21"/>
+      </w:r>
+    </w:p>
+    <w:p>
+      <w:pPr>
+        <w:rPr>
+          <w:b/>
+          <w:bCs/>
+        </w:rPr>
+      </w:pPr>
+      <w:r>
+        <w:rPr>
+          <w:b/>
+          <w:bCs/>
+          <w:highlight w:val="yellow"/>
+        </w:rPr>
+        <w:t xml:space="preserve">Radial Glia </w:t>
+      </w:r>
+      <w:proofErr w:type="spellStart"/>
+      <w:r>
+        <w:rPr>
+          <w:b/>
+          <w:bCs/>
+          <w:highlight w:val="yellow"/>
+        </w:rPr>
+        <w:t>subclustering</w:t>
+      </w:r>
+      <w:proofErr w:type="spellEnd"/>
+      <w:r>
+        <w:rPr>
+          <w:b/>
+          <w:bCs/>
+          <w:highlight w:val="yellow"/>
+        </w:rPr>
+        <w:t>…</w:t>
+      </w:r>
+      <w:commentRangeStart w:id="23"/>
+    </w:p>
+    <w:p>
+      <w:r>
+        <w:tab/>
+        <w:t xml:space="preserve">To gain a deeper understanding of the changes occurring in the radial glia, we next subclustered radial glia </w:t>
+      </w:r>
+      <w:proofErr w:type="gramStart"/>
+      <w:r>
+        <w:t>in to</w:t>
+      </w:r>
+      <w:proofErr w:type="gramEnd"/>
+      <w:r>
+        <w:t xml:space="preserve"> 6 subclusters referred to as 1_0 – 1_5 (</w:t>
+      </w:r>
+      <w:r>
+        <w:rPr>
+          <w:highlight w:val="yellow"/>
+        </w:rPr>
+        <w:t>see methods</w:t>
+      </w:r>
+      <w:r>
+        <w:t>). Using CytoTRACE</w:t>
+      </w:r>
+      <w:r>
+        <w:fldChar w:fldCharType="begin"/>
+      </w:r>
+      <w:r>
+        <w:instrText xml:space="preserve"> ADDIN ZOTERO_ITEM CSL_CITATION {"citationID":"jh0PC5gC","properties":{"formattedCitation":"\\super 13\\nosupersub{}","plainCitation":"13","noteIndex":0},"citationItems":[{"id":3274,"uris":["http://zotero.org/users/11313215/items/LEWHIU9W"],"itemData":{"id":3274,"type":"article-journal","abstract":"Single-cell RNA sequencing (scRNA-seq) is a powerful approach for reconstructing cellular differentiation trajectories. However, inferring both the state and direction of differentiation is challenging. Here, we demonstrate a simple, yet robust, determinant of developmental potential—the number of expressed genes per cell—and leverage this measure of transcriptional diversity to develop a computational framework (CytoTRACE) for predicting differentiation states from scRNA-seq data. When applied to diverse tissue types and organisms, CytoTRACE outperformed previous methods and nearly 19,000 annotated gene sets for resolving 52 experimentally determined developmental trajectories. Additionally, it facilitated the identification of quiescent stem cells and revealed genes that contribute to breast tumorigenesis. This study thus establishes a key RNA-based feature of developmental potential and a platform for delineation of cellular hierarchies.","container-title":"Science","DOI":"10.1126/science.aax0249","issue":"6476","note":"publisher: American Association for the Advancement of Science","page":"405-411","source":"science.org (Atypon)","title":"Single-cell transcriptional diversity is a hallmark of developmental potential","volume":"367","author":[{"family":"Gulati","given":"Gunsagar S."},{"family":"Sikandar","given":"Shaheen S."},{"family":"Wesche","given":"Daniel J."},{"family":"Manjunath","given":"Anoop"},{"family":"Bharadwaj","given":"Anjan"},{"family":"Berger","given":"Mark J."},{"family":"Ilagan","given":"Francisco"},{"family":"Kuo","given":"Angera H."},{"family":"Hsieh","given":"Robert W."},{"family":"Cai","given":"Shang"},{"family":"Zabala","given":"Maider"},{"family":"Scheeren","given":"Ferenc A."},{"family":"Lobo","given":"Neethan A."},{"family":"Qian","given":"Dalong"},{"family":"Yu","given":"Feiqiao B."},{"family":"Dirbas","given":"Frederick M."},{"family":"Clarke","given":"Michael F."},{"family":"Newman","given":"Aaron M."}],"issued":{"date-parts":[["2020",1,24]]}}}],"schema":"https://github.com/citation-style-language/schema/raw/master/csl-citation.json"} </w:instrText>
+      </w:r>
+      <w:r>
+        <w:fldChar w:fldCharType="separate"/>
+      </w:r>
+      <w:r>
+        <w:rPr>
+          <w:rFonts w:cs="Times New Roman"/>
+          <w:color w:val="000000"/>
+          <w:kern w:val="0"/>
+          <w:szCs w:val="24"/>
+          <w:vertAlign w:val="superscript"/>
+        </w:rPr>
+        <w:t>13</w:t>
+      </w:r>
+      <w:r>
+        <w:fldChar w:fldCharType="end"/>
+      </w:r>
+      <w:r>
+        <w:t>, we found that subclusters 1_1 and 1_3 represented immature populations while the rest were mature to various extents (f</w:t>
+      </w:r>
+      <w:r>
+        <w:rPr>
+          <w:highlight w:val="yellow"/>
+        </w:rPr>
+        <w:t>igure</w:t>
+      </w:r>
+      <w:r>
+        <w:t xml:space="preserve">). To further classify these clusters, we next examined their marker genes. </w:t>
+      </w:r>
+      <w:r>
+        <w:t xml:space="preserve">We identified subclusters </w:t>
+      </w:r>
+      <w:r>
+        <w:t xml:space="preserve">1_1 and </w:t>
+      </w:r>
+      <w:r>
+        <w:t>1_</w:t>
+      </w:r>
+      <w:r>
+        <w:t>3</w:t>
+      </w:r>
+      <w:r>
+        <w:t xml:space="preserve"> as </w:t>
+      </w:r>
+      <w:r>
+        <w:t>quiescent</w:t>
+      </w:r>
+      <w:r>
+        <w:t xml:space="preserve"> based on expression of </w:t>
+      </w:r>
+      <w:r>
+        <w:rPr>
+          <w:i/>
+          <w:iCs/>
+        </w:rPr>
+        <w:t>setd1a</w:t>
+      </w:r>
+      <w:r>
+        <w:rPr>
+          <w:i/>
+          <w:iCs/>
+        </w:rPr>
+        <w:t xml:space="preserve">, </w:t>
+      </w:r>
+      <w:r>
+        <w:t xml:space="preserve">increased expression of </w:t>
+      </w:r>
+      <w:proofErr w:type="spellStart"/>
+      <w:r>
+        <w:rPr>
+          <w:i/>
+          <w:iCs/>
+        </w:rPr>
+        <w:t>glula</w:t>
+      </w:r>
+      <w:proofErr w:type="spellEnd"/>
+      <w:r>
+        <w:t xml:space="preserve"> (</w:t>
+      </w:r>
+      <w:r>
+        <w:rPr>
+          <w:i/>
+          <w:iCs/>
+        </w:rPr>
+        <w:t>LOC111570141</w:t>
+      </w:r>
+      <w:r>
+        <w:t xml:space="preserve">), </w:t>
+      </w:r>
+      <w:r>
+        <w:rPr>
+          <w:i/>
+          <w:iCs/>
+        </w:rPr>
+        <w:t xml:space="preserve">fabp7b </w:t>
+      </w:r>
+      <w:r>
+        <w:t>(</w:t>
+      </w:r>
+      <w:r>
+        <w:rPr>
+          <w:i/>
+          <w:iCs/>
+        </w:rPr>
+        <w:t>LOC111575074</w:t>
+      </w:r>
+      <w:r>
+        <w:t>), and</w:t>
+      </w:r>
+      <w:r>
+        <w:rPr>
+          <w:i/>
+          <w:iCs/>
+        </w:rPr>
+        <w:t xml:space="preserve"> s100[beta], </w:t>
+      </w:r>
+      <w:r>
+        <w:t xml:space="preserve">and absence of </w:t>
+      </w:r>
+      <w:r>
+        <w:rPr>
+          <w:i/>
+          <w:iCs/>
+        </w:rPr>
+        <w:t xml:space="preserve">ccnd1 </w:t>
+      </w:r>
+      <w:r>
+        <w:t>(</w:t>
+      </w:r>
+      <w:r>
+        <w:rPr>
+          <w:highlight w:val="yellow"/>
+        </w:rPr>
+        <w:t>Figure</w:t>
+      </w:r>
+      <w:r>
+        <w:t>)</w:t>
+      </w:r>
+      <w:r>
+        <w:rPr>
+          <w:i/>
+          <w:iCs/>
+        </w:rPr>
+        <w:t xml:space="preserve"> </w:t>
+      </w:r>
+      <w:r>
+        <w:rPr>
+          <w:i/>
+          <w:iCs/>
+        </w:rPr>
+        <w:fldChar w:fldCharType="begin"/>
+      </w:r>
+      <w:r>
+        <w:rPr>
+          <w:i/>
+          <w:iCs/>
+        </w:rPr>
+        <w:instrText xml:space="preserve"> ADDIN ZOTERO_ITEM CSL_CITATION {"citationID":"VPOE020t","properties":{"formattedCitation":"\\super 14,15\\nosupersub{}","plainCitation":"14,15","noteIndex":0},"citationItems":[{"id":5397,"uris":["http://zotero.org/users/11313215/items/4VXMT6UF"],"itemData":{"id":5397,"type":"article-journal","abstract":"Zebrafish display widespread and pronounced adult neurogenesis, which is fundamental for their regeneration capability after central nervous system injury. However, the cellular identity and the biological properties of adult newborn neurons are elusive for most brain areas. Here, we have used short-term lineage tracing of radial glia progeny to prospectively isolate newborn neurons from the her4.1+ radial glia lineage in the homeostatic adult forebrain. Transcriptome analysis of radial glia, newborn neurons and mature neurons using single cell sequencing identified distinct transcriptional profiles, including novel markers for each population. Specifically, we detected two separate newborn neuron types, which showed diversity of cell fate commitment and location. Further analyses showed that these cell types are homologous to neurogenic cells in the mammalian brain, identified neurogenic commitment in proliferating radial glia and indicated that glutamatergic projection neurons are generated in the adult zebrafish telencephalon. Thus, we prospectively isolated adult newborn neurons from the adult zebrafish forebrain, identified markers for newborn and mature neurons in the adult brain, and revealed intrinsic heterogeneity among adult newborn neurons and their homology with mammalian adult neurogenic cell types.","container-title":"Development","DOI":"10.1242/dev.185595","ISSN":"0950-1991","issue":"1","journalAbbreviation":"Development","page":"dev185595","source":"Silverchair","title":"Single cell sequencing of radial glia progeny reveals the diversity of newborn neurons in the adult zebrafish brain","volume":"147","author":[{"family":"Lange","given":"Christian"},{"family":"Rost","given":"Fabian"},{"family":"Machate","given":"Anja"},{"family":"Reinhardt","given":"Susanne"},{"family":"Lesche","given":"Matthias"},{"family":"Weber","given":"Anke"},{"family":"Kuscha","given":"Veronika"},{"family":"Dahl","given":"Andreas"},{"family":"Rulands","given":"Steffen"},{"family":"Brand","given":"Michael"}],"issued":{"date-parts":[["2020",1,9]]}}},{"id":5395,"uris":["http://zotero.org/users/11313215/items/VRUJWZFZ"],"itemData":{"id":5395,"type":"article-journal","abstract":"Quiescence, a hallmark of adult neural stem cells (NSCs), is required for maintaining the NSC pool to support life-long continuous neurogenesis in the adult dentate gyrus (DG). Whether long-lasting epigenetic modifications maintain NSC quiescence over the long term in the adult DG is not well-understood. Here we show that mice with haploinsufficiency of Setd1a, a schizophrenia risk gene encoding a histone H3K4 methyltransferase, develop an enlarged DG with more dentate granule cells after young adulthood. Deletion of Setd1a specifically in quiescent NSCs in the adult DG promotes their activation and neurogenesis, which is countered by inhibition of the histone demethylase LSD1. Mechanistically, RNA-sequencing and CUT &amp; RUN analyses of cultured quiescent adult NSCs reveal Setd1a deletion-induced transcriptional changes and many Setd1a targets, among which down-regulation of Bhlhe40 promotes quiescent NSC activation in the adult DG in vivo. Together, our study reveals a Setd1a-dependent epigenetic mechanism that sustains NSC quiescence in the adult DG.","container-title":"Nature Communications","DOI":"10.1038/s41467-024-50010-y","ISSN":"2041-1723","issue":"1","journalAbbreviation":"Nat Commun","language":"en","license":"2024 The Author(s)","note":"publisher: Nature Publishing Group","page":"5674","source":"www.nature.com","title":"Epigenetic maintenance of adult neural stem cell quiescence in the mouse hippocampus via Setd1a","volume":"15","author":[{"family":"Zhao","given":"Ting"},{"family":"Hong","given":"Yan"},{"family":"Yan","given":"Bowen"},{"family":"Huang","given":"Suming"},{"family":"Ming","given":"Guo-li"},{"family":"Song","given":"Hongjun"}],"issued":{"date-parts":[["2024",7,6]]}}}],"schema":"https://github.com/citation-style-language/schema/raw/master/csl-citation.json"} </w:instrText>
+      </w:r>
+      <w:r>
+        <w:rPr>
+          <w:i/>
+          <w:iCs/>
+        </w:rPr>
+        <w:fldChar w:fldCharType="separate"/>
+      </w:r>
+      <w:r>
+        <w:rPr>
+          <w:rFonts w:cs="Times New Roman"/>
+          <w:color w:val="000000"/>
+          <w:kern w:val="0"/>
+          <w:szCs w:val="24"/>
+          <w:vertAlign w:val="superscript"/>
+        </w:rPr>
         <w:t>14,15</w:t>
       </w:r>
       <w:r>
@@ -2030,12 +3539,12 @@
       <w:r>
         <w:t xml:space="preserve">.  </w:t>
       </w:r>
-      <w:commentRangeEnd w:id="11"/>
+      <w:commentRangeEnd w:id="23"/>
       <w:r>
         <w:rPr>
           <w:rStyle w:val="CommentReference"/>
         </w:rPr>
-        <w:commentReference w:id="11"/>
+        <w:commentReference w:id="23"/>
       </w:r>
       <w:r>
         <w:t xml:space="preserve"> </w:t>
@@ -2313,1241 +3822,6 @@
         <w:t xml:space="preserve"> with the ATAC?])</w:t>
       </w:r>
     </w:p>
-    <w:p/>
-    <w:p>
-      <w:pPr>
-        <w:rPr>
-          <w:i/>
-          <w:iCs/>
-        </w:rPr>
-      </w:pPr>
-      <w:r>
-        <w:rPr>
-          <w:i/>
-          <w:iCs/>
-        </w:rPr>
-        <w:t xml:space="preserve">[Cluster 6] Is </w:t>
-      </w:r>
-      <w:r>
-        <w:rPr>
-          <w:i/>
-          <w:iCs/>
-        </w:rPr>
-        <w:t>Composed of Several Hypothalamic Cell Types</w:t>
-      </w:r>
-    </w:p>
-    <w:p>
-      <w:r>
-        <w:rPr>
-          <w:i/>
-          <w:iCs/>
-        </w:rPr>
-        <w:tab/>
-      </w:r>
-      <w:r>
-        <w:t xml:space="preserve">Marker gene analysis of cluster 6 revealed markers for several hypothalamic cell types including magnocellular and parvocellular neurosecretory preoptic area (NPO), gonadotropin releasing hormone (GnRH) neurons, and arcuate nucleus (ARC) neurons. We hypothesized that </w:t>
-      </w:r>
-      <w:proofErr w:type="spellStart"/>
-      <w:r>
-        <w:t>subclustering</w:t>
-      </w:r>
-      <w:proofErr w:type="spellEnd"/>
-      <w:r>
-        <w:t xml:space="preserve"> cluster 6 would separate these hypothalamic cell types into clusters that better aligned with </w:t>
-      </w:r>
-      <w:r>
-        <w:rPr>
-          <w:i/>
-          <w:iCs/>
-        </w:rPr>
-        <w:t>a priori</w:t>
-      </w:r>
-      <w:r>
-        <w:t xml:space="preserve"> knowledge about hypothalamic cell types.</w:t>
-      </w:r>
-    </w:p>
-    <w:p>
-      <w:pPr>
-        <w:ind w:firstLine="720"/>
-      </w:pPr>
-      <w:r>
-        <w:t xml:space="preserve"> </w:t>
-      </w:r>
-      <w:proofErr w:type="spellStart"/>
-      <w:r>
-        <w:t>Subclustering</w:t>
-      </w:r>
-      <w:proofErr w:type="spellEnd"/>
-      <w:r>
-        <w:t xml:space="preserve"> resulted in 4 subclusters (6_0 through 6_3). Cluster 6_0 expressed several steroid hormone receptors including </w:t>
-      </w:r>
-      <w:r>
-        <w:rPr>
-          <w:i/>
-          <w:iCs/>
-        </w:rPr>
-        <w:t xml:space="preserve">esr2b, </w:t>
-      </w:r>
-      <w:proofErr w:type="spellStart"/>
-      <w:r>
-        <w:rPr>
-          <w:i/>
-          <w:iCs/>
-        </w:rPr>
-        <w:t>ar</w:t>
-      </w:r>
-      <w:proofErr w:type="spellEnd"/>
-      <w:r>
-        <w:rPr>
-          <w:i/>
-          <w:iCs/>
-        </w:rPr>
-        <w:t xml:space="preserve">, </w:t>
-      </w:r>
-      <w:r>
-        <w:t>and</w:t>
-      </w:r>
-      <w:r>
-        <w:t xml:space="preserve"> </w:t>
-      </w:r>
-      <w:proofErr w:type="spellStart"/>
-      <w:r>
-        <w:t>pgr</w:t>
-      </w:r>
-      <w:proofErr w:type="spellEnd"/>
-      <w:r>
-        <w:t xml:space="preserve"> as well as </w:t>
-      </w:r>
-      <w:proofErr w:type="spellStart"/>
-      <w:r>
-        <w:rPr>
-          <w:i/>
-          <w:iCs/>
-        </w:rPr>
-        <w:t>cckbra</w:t>
-      </w:r>
-      <w:proofErr w:type="spellEnd"/>
-      <w:r>
-        <w:t xml:space="preserve"> and POA markers </w:t>
-      </w:r>
-      <w:r>
-        <w:rPr>
-          <w:i/>
-          <w:iCs/>
-        </w:rPr>
-        <w:t xml:space="preserve">hmx2 </w:t>
-      </w:r>
-      <w:r>
-        <w:lastRenderedPageBreak/>
-        <w:t xml:space="preserve">and </w:t>
-      </w:r>
-      <w:r>
-        <w:rPr>
-          <w:i/>
-          <w:iCs/>
-        </w:rPr>
-        <w:t>hmx3a</w:t>
-      </w:r>
-      <w:r>
-        <w:t xml:space="preserve"> (</w:t>
-      </w:r>
-      <w:r>
-        <w:rPr>
-          <w:highlight w:val="yellow"/>
-        </w:rPr>
-        <w:t>CITATION</w:t>
-      </w:r>
-      <w:r>
-        <w:t>). Thus, we hereafter refer to this cell type as steroid receptor + POA (SR+POA).</w:t>
-      </w:r>
-    </w:p>
-    <w:p>
-      <w:pPr>
-        <w:ind w:firstLine="720"/>
-      </w:pPr>
-      <w:commentRangeStart w:id="12"/>
-      <w:r>
-        <w:t xml:space="preserve">Cluster 6_1 was marked by expression of </w:t>
-      </w:r>
-      <w:r>
-        <w:rPr>
-          <w:i/>
-          <w:iCs/>
-        </w:rPr>
-        <w:t>sox5</w:t>
-      </w:r>
-      <w:r>
-        <w:t xml:space="preserve">, </w:t>
-      </w:r>
-      <w:proofErr w:type="spellStart"/>
-      <w:r>
-        <w:rPr>
-          <w:i/>
-          <w:iCs/>
-        </w:rPr>
-        <w:t>rorb</w:t>
-      </w:r>
-      <w:proofErr w:type="spellEnd"/>
-      <w:r>
-        <w:t xml:space="preserve">, </w:t>
-      </w:r>
-      <w:r>
-        <w:rPr>
-          <w:i/>
-          <w:iCs/>
-        </w:rPr>
-        <w:t>gal,</w:t>
-      </w:r>
-      <w:r>
-        <w:t xml:space="preserve"> </w:t>
-      </w:r>
-      <w:proofErr w:type="spellStart"/>
-      <w:r>
-        <w:rPr>
-          <w:i/>
-          <w:iCs/>
-        </w:rPr>
-        <w:t>trhra</w:t>
-      </w:r>
-      <w:proofErr w:type="spellEnd"/>
-      <w:r>
-        <w:rPr>
-          <w:i/>
-          <w:iCs/>
-        </w:rPr>
-        <w:t xml:space="preserve"> </w:t>
-      </w:r>
-      <w:r>
-        <w:t xml:space="preserve">and </w:t>
-      </w:r>
-      <w:proofErr w:type="spellStart"/>
-      <w:r>
-        <w:rPr>
-          <w:i/>
-          <w:iCs/>
-        </w:rPr>
-        <w:t>trhrb</w:t>
-      </w:r>
-      <w:proofErr w:type="spellEnd"/>
-      <w:r>
-        <w:t xml:space="preserve">, and </w:t>
-      </w:r>
-      <w:r>
-        <w:rPr>
-          <w:i/>
-          <w:iCs/>
-        </w:rPr>
-        <w:t xml:space="preserve">prlh2 </w:t>
-      </w:r>
-      <w:r>
-        <w:t xml:space="preserve">as well as the previously mentioned </w:t>
-      </w:r>
-      <w:r>
-        <w:rPr>
-          <w:i/>
-          <w:iCs/>
-        </w:rPr>
-        <w:t xml:space="preserve">hmx2 </w:t>
-      </w:r>
-      <w:r>
-        <w:t xml:space="preserve">and </w:t>
-      </w:r>
-      <w:r>
-        <w:rPr>
-          <w:i/>
-          <w:iCs/>
-        </w:rPr>
-        <w:t xml:space="preserve">hmx3a. </w:t>
-      </w:r>
-      <w:r>
-        <w:t xml:space="preserve">Importantly, 6_1 also expressed </w:t>
-      </w:r>
-      <w:proofErr w:type="spellStart"/>
-      <w:r>
-        <w:rPr>
-          <w:i/>
-          <w:iCs/>
-        </w:rPr>
-        <w:t>npy</w:t>
-      </w:r>
-      <w:proofErr w:type="spellEnd"/>
-      <w:r>
-        <w:t xml:space="preserve"> and </w:t>
-      </w:r>
-      <w:proofErr w:type="spellStart"/>
-      <w:r>
-        <w:rPr>
-          <w:i/>
-          <w:iCs/>
-        </w:rPr>
-        <w:t>pomc</w:t>
-      </w:r>
-      <w:proofErr w:type="spellEnd"/>
-      <w:r>
-        <w:rPr>
-          <w:i/>
-          <w:iCs/>
-        </w:rPr>
-        <w:t xml:space="preserve"> </w:t>
-      </w:r>
-      <w:r>
-        <w:t>(</w:t>
-      </w:r>
-      <w:r>
-        <w:rPr>
-          <w:i/>
-          <w:iCs/>
-        </w:rPr>
-        <w:t>LOC111584656</w:t>
-      </w:r>
-      <w:r>
-        <w:t>) suggesting this cell type is homologous to ARC</w:t>
-      </w:r>
-      <w:r>
-        <w:fldChar w:fldCharType="begin"/>
-      </w:r>
-      <w:r>
-        <w:instrText xml:space="preserve"> ADDIN ZOTERO_ITEM CSL_CITATION {"citationID":"yjL9fTP6","properties":{"formattedCitation":"\\super 7,8\\nosupersub{}","plainCitation":"7,8","noteIndex":0},"citationItems":[{"id":5502,"uris":["http://zotero.org/users/11313215/items/PEMB8LNT"],"itemData":{"id":5502,"type":"article-journal","abstract":"Owing to its complex structure and highly diverse cell populations, the study of hypothalamic development has historically lagged behind that of other brain regions. However, in recent years, a greatly expanded understanding of hypothalamic gene expression during development has opened up new avenues of investigation. In this review, we synthesize existing work to present a holistic picture of hypothalamic development from early induction and patterning through nuclear specification and differentiation, with a particular emphasis on determination of cell fate. We will also touch on special topics in the field including the prosomere model, adult neurogenesis, and integration of migratory cells originating outside the hypothalamic neuroepithelium, and how these topics relate to our broader theme. WIREs Dev Biol 2015, 4:445–468. doi: 10.1002/wdev.187 This article is categorized under: Nervous System Development &gt; Vertebrates: General Principles","container-title":"WIREs Developmental Biology","DOI":"10.1002/wdev.187","ISSN":"1759-7692","issue":"5","language":"en","note":"_eprint: https://wires.onlinelibrary.wiley.com/doi/pdf/10.1002/wdev.187","page":"445-468","source":"Wiley Online Library","title":"Patterning, specification, and differentiation in the developing hypothalamus","volume":"4","author":[{"family":"Bedont","given":"Joseph L."},{"family":"Newman","given":"Elizabeth A."},{"family":"Blackshaw","given":"Seth"}],"issued":{"date-parts":[["2015"]]}}},{"id":5479,"uris":["http://zotero.org/users/11313215/items/SCF5RD7Z"],"itemData":{"id":5479,"type":"article-journal","abstract":"The hypothalamus, which regulates fundamental aspects of physiological homeostasis and behavior, is a brain region that exhibits highly conserved anatomy across vertebrate species. Its development involves conserved basic mechanisms of induction and patterning, combined with a more plastic process of neuronal fate specification, to produce brain circuits that mediate physiology and behavior according to the needs of each species. Here, we review the factors involved in the induction, patterning and neuronal differentiation of the hypothalamus, highlighting recent evidence that illustrates how changes in Wnt/β-catenin signaling during development may lead to species-specific form and function of this important brain structure., Summary: This Review discusses the factors involved in hypothalamic induction, patterning and differentiation, highlighting how changes in Wnt signaling may lead to species-specific hypothalamic form and function.","container-title":"Development (Cambridge, England)","DOI":"10.1242/dev.139055","ISSN":"0950-1991","issue":"9","journalAbbreviation":"Development","note":"PMID: 28465334\nPMCID: PMC5450842","page":"1588-1599","source":"PubMed Central","title":"Development of the hypothalamus: conservation, modification and innovation","title-short":"Development of the hypothalamus","volume":"144","author":[{"family":"Xie","given":"Yuanyuan"},{"family":"Dorsky","given":"Richard I."}],"issued":{"date-parts":[["2017",5,1]]}}}],"schema":"https://github.com/citation-style-language/schema/raw/master/csl-citation.json"} </w:instrText>
-      </w:r>
-      <w:r>
-        <w:fldChar w:fldCharType="separate"/>
-      </w:r>
-      <w:r>
-        <w:rPr>
-          <w:rFonts w:cs="Times New Roman"/>
-          <w:color w:val="000000"/>
-          <w:kern w:val="0"/>
-          <w:szCs w:val="24"/>
-          <w:vertAlign w:val="superscript"/>
-        </w:rPr>
-        <w:t>7,8</w:t>
-      </w:r>
-      <w:r>
-        <w:fldChar w:fldCharType="end"/>
-      </w:r>
-      <w:r>
-        <w:t>.</w:t>
-      </w:r>
-      <w:r>
-        <w:rPr>
-          <w:i/>
-          <w:iCs/>
-        </w:rPr>
-        <w:t xml:space="preserve"> </w:t>
-      </w:r>
-      <w:r>
-        <w:t>We therefore refer to this cluster as ARC.</w:t>
-      </w:r>
-      <w:commentRangeEnd w:id="12"/>
-      <w:r>
-        <w:rPr>
-          <w:rStyle w:val="CommentReference"/>
-        </w:rPr>
-        <w:commentReference w:id="12"/>
-      </w:r>
-    </w:p>
-    <w:p>
-      <w:pPr>
-        <w:ind w:firstLine="720"/>
-      </w:pPr>
-      <w:r>
-        <w:t xml:space="preserve">Cluster 6_2 expressed all of the canonical NPO markers including </w:t>
-      </w:r>
-      <w:proofErr w:type="spellStart"/>
-      <w:r>
-        <w:rPr>
-          <w:i/>
-          <w:iCs/>
-        </w:rPr>
-        <w:t>avp</w:t>
-      </w:r>
-      <w:proofErr w:type="spellEnd"/>
-      <w:r>
-        <w:rPr>
-          <w:i/>
-          <w:iCs/>
-        </w:rPr>
-        <w:t xml:space="preserve">, </w:t>
-      </w:r>
-      <w:proofErr w:type="spellStart"/>
-      <w:r>
-        <w:rPr>
-          <w:i/>
-          <w:iCs/>
-        </w:rPr>
-        <w:t>oxt</w:t>
-      </w:r>
-      <w:proofErr w:type="spellEnd"/>
-      <w:r>
-        <w:rPr>
-          <w:i/>
-          <w:iCs/>
-        </w:rPr>
-        <w:t xml:space="preserve">, </w:t>
-      </w:r>
-      <w:proofErr w:type="spellStart"/>
-      <w:r>
-        <w:rPr>
-          <w:i/>
-          <w:iCs/>
-        </w:rPr>
-        <w:t>nts</w:t>
-      </w:r>
-      <w:proofErr w:type="spellEnd"/>
-      <w:r>
-        <w:rPr>
-          <w:i/>
-          <w:iCs/>
-        </w:rPr>
-        <w:t xml:space="preserve">, </w:t>
-      </w:r>
-      <w:proofErr w:type="spellStart"/>
-      <w:r>
-        <w:rPr>
-          <w:i/>
-          <w:iCs/>
-        </w:rPr>
-        <w:t>trh</w:t>
-      </w:r>
-      <w:proofErr w:type="spellEnd"/>
-      <w:r>
-        <w:rPr>
-          <w:i/>
-          <w:iCs/>
-        </w:rPr>
-        <w:t xml:space="preserve">, </w:t>
-      </w:r>
-      <w:proofErr w:type="spellStart"/>
-      <w:r>
-        <w:rPr>
-          <w:i/>
-          <w:iCs/>
-        </w:rPr>
-        <w:t>crhb</w:t>
-      </w:r>
-      <w:proofErr w:type="spellEnd"/>
-      <w:r>
-        <w:rPr>
-          <w:i/>
-          <w:iCs/>
-        </w:rPr>
-        <w:t xml:space="preserve">, </w:t>
-      </w:r>
-      <w:proofErr w:type="spellStart"/>
-      <w:r>
-        <w:rPr>
-          <w:i/>
-          <w:iCs/>
-        </w:rPr>
-        <w:t>otpa,</w:t>
-      </w:r>
-      <w:r>
-        <w:t>and</w:t>
-      </w:r>
-      <w:proofErr w:type="spellEnd"/>
-      <w:r>
-        <w:t xml:space="preserve"> </w:t>
-      </w:r>
-      <w:r>
-        <w:rPr>
-          <w:i/>
-          <w:iCs/>
-        </w:rPr>
-        <w:t>fezf2</w:t>
-      </w:r>
-      <w:r>
-        <w:t xml:space="preserve"> </w:t>
-      </w:r>
-      <w:r>
-        <w:fldChar w:fldCharType="begin"/>
-      </w:r>
-      <w:r>
-        <w:instrText xml:space="preserve"> ADDIN ZOTERO_ITEM CSL_CITATION {"citationID":"nP8Kuhd9","properties":{"formattedCitation":"\\super 9,10\\nosupersub{}","plainCitation":"9,10","noteIndex":0},"citationItems":[{"id":5472,"uris":["http://zotero.org/users/11313215/items/GN7FM3HU"],"itemData":{"id":5472,"type":"article-journal","abstract":"The paraventricular nucleus (PVN) of the hypothalamus in mammals coordinates neuroendocrine, autonomic and behavioral responses pivotal for homeostasis and the stress response. A large amount of studies in rodents has documented that the PVN contains diverse neuronal cell types which can be identified by the expression of distinct secretory neuropeptides. Interestingly, PVN cell types often coexpress multiple neuropeptides whose relative coexpression level are subject to environment-induced plasticity.Due to their small size and transparency, zebrafish larvae offer the possibility to comprehensively study the development and plasticity of the PVN in large groups of intact animals, yet important anatomical information about the larval zebrafish PVN-homologous region has been missing. Therefore we recently defined the location and borders of the larval neurosecretory preoptic area (NPO) as the PVN-homologous region in larval zebrafish based on transcription factor expression and cell type clustering. To identify distinct cell types present in the larval NPO, we also generated a comprehensive 3D map of 9 zebrafish homologs of typical neuropeptides found in the mammalian PVN (arginine vasopressin, corticotropin-releasing hormone, proenkephalin a/b, neurotensin, oxytocin, vasoactive intestinal peptide, cholecystokinin, and somatostatin). Here we extend this chemoarchitectural map to include the degrees of coexpression of two neuropeptides in the same cell by performing systematic pairwise comparisons. Our results allowed the subclassification of NPO cell types, and differences in variability of coexpression profiles suggest potential targets of biochemical plasticity. Thus, this work provides an important basis for the analysis of the development, function, and plasticity of the primary neuroendocrine brain region in larval zebrafish.","container-title":"Frontiers in Neuroanatomy","DOI":"10.3389/fnana.2015.00002","ISSN":"1662-5129","journalAbbreviation":"Front. Neuroanat.","language":"English","note":"publisher: Frontiers","source":"Frontiers","title":"Coexpression analysis of nine neuropeptides in the neurosecretory preoptic area of larval zebrafish","URL":"https://www.frontiersin.org/journals/neuroanatomy/articles/10.3389/fnana.2015.00002/full","volume":"9","author":[{"family":"Herget","given":"Ulrich"},{"family":"Ryu","given":"Soojin"}],"accessed":{"date-parts":[["2026",1,29]]},"issued":{"date-parts":[["2015",2,12]]}}},{"id":5460,"uris":["http://zotero.org/users/11313215/items/T6MQRQIF"],"itemData":{"id":5460,"type":"article-journal","abstract":"The homeodomain transcription factor Orthopedia (Otp) is an important regulator for specification of defined subsets of neuroendocrine cells and dopaminergic neurons in vertebrates. In zebrafish, two paralogous otp genes, otpa and otpb, are present in the genome. Neither complete loss of Otp activity nor differential contributions of Otpa and Otpb to specification of defined neuronal populations have been analyzed in detail. We characterized zebrafish embryos and early larvae mutant for null alleles of otpa, otpb, or both genes to determine their individual contributions to the specification of th expressing dopaminergic neuronal populations as well as of crh, oxt, avp, trh or sst1.1 expressing neuroendocrine cells. otpa mutant larvae show an almost complete reduction of ventral diencephalic dopaminergic neurons, as reported previously. A small reduction in the number of trh cells in the preoptic region is detectable in otpa mutants, but no significant loss of crh, oxt and avp preoptic neuroendocrine cells. otpb single mutant larvae do not display a reduction in dopaminergic neurons or neuroendocrine cells in the otp expressing regions. In contrast, in otpa and otpb double mutant larvae specific groups of dopaminergic neurons as well as of crh, oxt, avp, trh and sst1.1-expressing neuroendocrine cells are completely lost. These observations suggest that the requirement for otpa and otpb function during development of the larval diencephalon is partially redundant. During evolutionary diversification of the paralogous otp genes, otpa maintained the prominent role in ventral diencephalic dopaminergic and neuroendocrine cell specification and is capable of partially compensating otpb loss of function. In addition, we identified a role of Otp in the development of a domain of somatostatin1-expressing cells in the rostral hindbrain, a region with strong otp expression but so far uncharacterized Otp function. Otp may thus be crucial for defined neuronal cell types also in the hindbrain.","container-title":"PLOS ONE","DOI":"10.1371/journal.pone.0075002","ISSN":"1932-6203","issue":"9","journalAbbreviation":"PLOS ONE","language":"en","note":"publisher: Public Library of Science","page":"e75002","source":"PLoS Journals","title":"Orthopedia Transcription Factor otpa and otpb Paralogous Genes Function during Dopaminergic and Neuroendocrine Cell Specification in Larval Zebrafish","volume":"8","author":[{"family":"Fernandes","given":"António M."},{"family":"Beddows","given":"Erin"},{"family":"Filippi","given":"Alida"},{"family":"Driever","given":"Wolfgang"}],"issued":{"date-parts":[["2013",9,20]]}}}],"schema":"https://github.com/citation-style-language/schema/raw/master/csl-citation.json"} </w:instrText>
-      </w:r>
-      <w:r>
-        <w:fldChar w:fldCharType="separate"/>
-      </w:r>
-      <w:r>
-        <w:rPr>
-          <w:rFonts w:cs="Times New Roman"/>
-          <w:color w:val="000000"/>
-          <w:kern w:val="0"/>
-          <w:szCs w:val="24"/>
-          <w:vertAlign w:val="superscript"/>
-        </w:rPr>
-        <w:t>9,10</w:t>
-      </w:r>
-      <w:r>
-        <w:fldChar w:fldCharType="end"/>
-      </w:r>
-      <w:r>
-        <w:t xml:space="preserve">. Thus, we hereafter refer to this this cluster as NPO. </w:t>
-      </w:r>
-    </w:p>
-    <w:p>
-      <w:pPr>
-        <w:ind w:firstLine="720"/>
-      </w:pPr>
-      <w:r>
-        <w:t xml:space="preserve">Cluster 6_3 was the only cell type in our dataset to express </w:t>
-      </w:r>
-      <w:r>
-        <w:rPr>
-          <w:i/>
-          <w:iCs/>
-        </w:rPr>
-        <w:t>gnrh1 (</w:t>
-      </w:r>
-      <w:r>
-        <w:rPr>
-          <w:i/>
-          <w:iCs/>
-        </w:rPr>
-        <w:t>LOC111571064</w:t>
-      </w:r>
-      <w:r>
-        <w:rPr>
-          <w:i/>
-          <w:iCs/>
-        </w:rPr>
-        <w:t>)</w:t>
-      </w:r>
-      <w:r>
-        <w:t xml:space="preserve">, it was marked by </w:t>
-      </w:r>
-      <w:proofErr w:type="spellStart"/>
-      <w:r>
-        <w:rPr>
-          <w:i/>
-          <w:iCs/>
-        </w:rPr>
-        <w:t>ndnf</w:t>
-      </w:r>
-      <w:proofErr w:type="spellEnd"/>
-      <w:r>
-        <w:t xml:space="preserve">, </w:t>
-      </w:r>
-      <w:r>
-        <w:rPr>
-          <w:i/>
-          <w:iCs/>
-        </w:rPr>
-        <w:t xml:space="preserve">six6a, </w:t>
-      </w:r>
-      <w:proofErr w:type="spellStart"/>
-      <w:r>
-        <w:rPr>
-          <w:i/>
-          <w:iCs/>
-        </w:rPr>
-        <w:t>roraa</w:t>
-      </w:r>
-      <w:proofErr w:type="spellEnd"/>
-      <w:r>
-        <w:rPr>
-          <w:i/>
-          <w:iCs/>
-        </w:rPr>
-        <w:t>, crhr1 (</w:t>
-      </w:r>
-      <w:r>
-        <w:rPr>
-          <w:i/>
-          <w:iCs/>
-        </w:rPr>
-        <w:t>LOC111584347</w:t>
-      </w:r>
-      <w:r>
-        <w:rPr>
-          <w:i/>
-          <w:iCs/>
-        </w:rPr>
-        <w:t xml:space="preserve">), </w:t>
-      </w:r>
-      <w:r>
-        <w:t xml:space="preserve">and </w:t>
-      </w:r>
-      <w:proofErr w:type="spellStart"/>
-      <w:r>
-        <w:rPr>
-          <w:i/>
-          <w:iCs/>
-        </w:rPr>
-        <w:t>cckbrb</w:t>
-      </w:r>
-      <w:proofErr w:type="spellEnd"/>
-      <w:r>
-        <w:rPr>
-          <w:i/>
-          <w:iCs/>
-        </w:rPr>
-        <w:t xml:space="preserve">. </w:t>
-      </w:r>
-      <w:r>
-        <w:t xml:space="preserve">We hereafter refer to this cluster </w:t>
-      </w:r>
-      <w:commentRangeStart w:id="13"/>
-      <w:r>
-        <w:t>as GnRH neurons</w:t>
-      </w:r>
-      <w:commentRangeEnd w:id="13"/>
-      <w:r>
-        <w:rPr>
-          <w:rStyle w:val="CommentReference"/>
-        </w:rPr>
-        <w:commentReference w:id="13"/>
-      </w:r>
-      <w:r>
-        <w:t xml:space="preserve">. </w:t>
-      </w:r>
-    </w:p>
-    <w:p>
-      <w:pPr>
-        <w:ind w:firstLine="720"/>
-      </w:pPr>
-      <w:r>
-        <w:t xml:space="preserve">Interestingly, ARC and NPO were strongly marked by several canonical immediate early genes (IEGS) including </w:t>
-      </w:r>
-      <w:r>
-        <w:rPr>
-          <w:i/>
-          <w:iCs/>
-        </w:rPr>
-        <w:t xml:space="preserve">egr1, </w:t>
-      </w:r>
-      <w:proofErr w:type="spellStart"/>
-      <w:r>
-        <w:rPr>
-          <w:i/>
-          <w:iCs/>
-        </w:rPr>
-        <w:t>fosb</w:t>
-      </w:r>
-      <w:proofErr w:type="spellEnd"/>
-      <w:r>
-        <w:rPr>
-          <w:i/>
-          <w:iCs/>
-        </w:rPr>
-        <w:t>, npas4a</w:t>
-      </w:r>
-      <w:r>
-        <w:t xml:space="preserve">. </w:t>
-      </w:r>
-    </w:p>
-    <w:p/>
-    <w:p>
-      <w:r>
-        <w:tab/>
-      </w:r>
-    </w:p>
-    <w:p>
-      <w:pPr>
-        <w:rPr>
-          <w:b/>
-          <w:bCs/>
-        </w:rPr>
-      </w:pPr>
-      <w:r>
-        <w:rPr>
-          <w:b/>
-          <w:bCs/>
-        </w:rPr>
-        <w:t xml:space="preserve">[Cluster 6] Undergoes </w:t>
-      </w:r>
-      <w:r>
-        <w:rPr>
-          <w:b/>
-          <w:bCs/>
-        </w:rPr>
-        <w:t>Synaptic</w:t>
-      </w:r>
-      <w:r>
-        <w:rPr>
-          <w:b/>
-          <w:bCs/>
-        </w:rPr>
-        <w:t xml:space="preserve"> </w:t>
-      </w:r>
-      <w:r>
-        <w:rPr>
-          <w:b/>
-          <w:bCs/>
-        </w:rPr>
-        <w:t>and Extracellular Matrix Remodeling in Intermediates</w:t>
-      </w:r>
-    </w:p>
-    <w:p>
-      <w:pPr>
-        <w:ind w:firstLine="720"/>
-      </w:pPr>
-      <w:commentRangeStart w:id="14"/>
-      <w:r>
-        <w:t>Our DEG analysis of [cluster6] revealed several changes in genes associated with the extracellular matrix, cell-cell adhesion, and the synapse.</w:t>
-      </w:r>
-      <w:r>
-        <w:t xml:space="preserve"> In intermediates, neurexophilin-1 (</w:t>
-      </w:r>
-      <w:r>
-        <w:rPr>
-          <w:i/>
-          <w:iCs/>
-        </w:rPr>
-        <w:t>nxph1</w:t>
-      </w:r>
-      <w:r>
-        <w:t xml:space="preserve">), </w:t>
-      </w:r>
-      <w:proofErr w:type="spellStart"/>
-      <w:r>
-        <w:t>contactin</w:t>
-      </w:r>
-      <w:proofErr w:type="spellEnd"/>
-      <w:r>
-        <w:t xml:space="preserve"> 4 (</w:t>
-      </w:r>
-      <w:r>
-        <w:rPr>
-          <w:i/>
-          <w:iCs/>
-        </w:rPr>
-        <w:t>cntn4</w:t>
-      </w:r>
-      <w:r>
-        <w:t xml:space="preserve">), </w:t>
-      </w:r>
-      <w:proofErr w:type="spellStart"/>
-      <w:r>
-        <w:t>contactin</w:t>
-      </w:r>
-      <w:proofErr w:type="spellEnd"/>
-      <w:r>
-        <w:t xml:space="preserve"> associated protein 4 (</w:t>
-      </w:r>
-      <w:r>
-        <w:rPr>
-          <w:i/>
-          <w:iCs/>
-        </w:rPr>
-        <w:t>cntnap4</w:t>
-      </w:r>
-      <w:r>
-        <w:t xml:space="preserve">), and </w:t>
-      </w:r>
-      <w:proofErr w:type="spellStart"/>
-      <w:r>
-        <w:t>procadherin</w:t>
-      </w:r>
-      <w:proofErr w:type="spellEnd"/>
-      <w:r>
-        <w:t xml:space="preserve"> 10b (</w:t>
-      </w:r>
-      <w:r>
-        <w:rPr>
-          <w:i/>
-          <w:iCs/>
-        </w:rPr>
-        <w:t>pcdh10b</w:t>
-      </w:r>
-      <w:r>
-        <w:t xml:space="preserve">) were significantly upregulated. Given that these DEGs are associated with the formation and stabilization of synaptic connections, this suggests the intermediate state is characterized by synaptogenesis in [cluster </w:t>
-      </w:r>
-      <w:proofErr w:type="gramStart"/>
-      <w:r>
-        <w:t>6](</w:t>
-      </w:r>
-      <w:proofErr w:type="gramEnd"/>
-      <w:r>
-        <w:rPr>
-          <w:highlight w:val="yellow"/>
-        </w:rPr>
-        <w:t>CITATIONS</w:t>
-      </w:r>
-      <w:r>
-        <w:t xml:space="preserve">). </w:t>
-      </w:r>
-    </w:p>
-    <w:p>
-      <w:pPr>
-        <w:ind w:firstLine="720"/>
-      </w:pPr>
-      <w:r>
-        <w:t xml:space="preserve">Further, intermediates had significantly upregulated </w:t>
-      </w:r>
-      <w:proofErr w:type="spellStart"/>
-      <w:r>
-        <w:t>syndecan</w:t>
-      </w:r>
-      <w:proofErr w:type="spellEnd"/>
-      <w:r>
-        <w:t xml:space="preserve"> 2 (</w:t>
-      </w:r>
-      <w:r>
-        <w:rPr>
-          <w:i/>
-          <w:iCs/>
-        </w:rPr>
-        <w:t>sdc2</w:t>
-      </w:r>
-      <w:r>
-        <w:t xml:space="preserve">) and </w:t>
-      </w:r>
-      <w:r>
-        <w:t>dermatan sulfate epimerase-like (</w:t>
-      </w:r>
-      <w:proofErr w:type="spellStart"/>
-      <w:r>
-        <w:rPr>
-          <w:i/>
-          <w:iCs/>
-        </w:rPr>
-        <w:t>dse</w:t>
-      </w:r>
-      <w:proofErr w:type="spellEnd"/>
-      <w:r>
-        <w:rPr>
-          <w:i/>
-          <w:iCs/>
-        </w:rPr>
-        <w:t>-like</w:t>
-      </w:r>
-      <w:r>
-        <w:t xml:space="preserve">, </w:t>
-      </w:r>
-      <w:r>
-        <w:rPr>
-          <w:i/>
-          <w:iCs/>
-        </w:rPr>
-        <w:t>LOC111585095</w:t>
-      </w:r>
-      <w:r>
-        <w:t>), and downregulation of brevican (</w:t>
-      </w:r>
-      <w:proofErr w:type="spellStart"/>
-      <w:r>
-        <w:rPr>
-          <w:i/>
-          <w:iCs/>
-        </w:rPr>
-        <w:t>bcan</w:t>
-      </w:r>
-      <w:proofErr w:type="spellEnd"/>
-      <w:r>
-        <w:t xml:space="preserve">). This suggests major remodeling of the extracellular matrix, particularly around the synapse. </w:t>
-      </w:r>
-      <w:proofErr w:type="spellStart"/>
-      <w:r>
-        <w:t>Syndecan</w:t>
-      </w:r>
-      <w:proofErr w:type="spellEnd"/>
-      <w:r>
-        <w:t xml:space="preserve"> 2 is a heparin sulfate proteoglycan which functions as a fibroblast growth factor coreceptor, while dermatan sulfate epimerases increase the flexibility of the extracellular matrix (ECM) (</w:t>
-      </w:r>
-      <w:r>
-        <w:rPr>
-          <w:highlight w:val="yellow"/>
-        </w:rPr>
-        <w:t>CITATIONS</w:t>
-      </w:r>
-      <w:r>
-        <w:t>). Additionally, brevican is a major constituent of perineuronal nets which restrict neuroplasticity (CITATION)</w:t>
-      </w:r>
-      <w:r>
-        <w:t xml:space="preserve">. </w:t>
-      </w:r>
-      <w:r>
-        <w:t xml:space="preserve">Further evidence for the ECM remodeling comes from the transient downregulation of, </w:t>
-      </w:r>
-      <w:r>
-        <w:rPr>
-          <w:i/>
-          <w:iCs/>
-        </w:rPr>
-        <w:t>cd87-like</w:t>
-      </w:r>
-      <w:r>
-        <w:t xml:space="preserve"> (</w:t>
-      </w:r>
-      <w:r>
-        <w:t>LOC111577100</w:t>
-      </w:r>
-      <w:r>
-        <w:t>) in intermediates, before being strongly upregulated in females.</w:t>
-      </w:r>
-      <w:r>
-        <w:t xml:space="preserve"> </w:t>
-      </w:r>
-      <w:r>
-        <w:rPr>
-          <w:highlight w:val="red"/>
-        </w:rPr>
-        <w:t>CD87 promotes ECM degradation, its downregulation may suggest …?</w:t>
-      </w:r>
-      <w:r>
-        <w:t xml:space="preserve"> </w:t>
-      </w:r>
-      <w:r>
-        <w:t xml:space="preserve"> Taken together, these changes further support the notion that major synaptic plasticity occurs in intermediates in cluster 6.    </w:t>
-      </w:r>
-      <w:commentRangeEnd w:id="14"/>
-      <w:r>
-        <w:rPr>
-          <w:rStyle w:val="CommentReference"/>
-        </w:rPr>
-        <w:commentReference w:id="14"/>
-      </w:r>
-    </w:p>
-    <w:p/>
-    <w:p/>
-    <w:p>
-      <w:pPr>
-        <w:rPr>
-          <w:b/>
-          <w:bCs/>
-        </w:rPr>
-      </w:pPr>
-      <w:r>
-        <w:rPr>
-          <w:b/>
-          <w:bCs/>
-        </w:rPr>
-        <w:t xml:space="preserve">[Cluster 6] </w:t>
-      </w:r>
-      <w:r>
-        <w:rPr>
-          <w:b/>
-          <w:bCs/>
-        </w:rPr>
-        <w:t>Undergoes Changes in Neurotransmitter and Action Potential Characteristics</w:t>
-      </w:r>
-    </w:p>
-    <w:p>
-      <w:r>
-        <w:tab/>
-        <w:t>Interestingly, in our DEG analysis we found GABA and glutamate receptors to be differentially expressed over the course of sex change. Specifically, the metabotropic glutamate receptor (</w:t>
-      </w:r>
-      <w:r>
-        <w:rPr>
-          <w:i/>
-          <w:iCs/>
-        </w:rPr>
-        <w:t>grm5a</w:t>
-      </w:r>
-      <w:r>
-        <w:t>) was transiently downregulated in intermediates, while the type A GABA receptor (</w:t>
-      </w:r>
-      <w:r>
-        <w:rPr>
-          <w:i/>
-          <w:iCs/>
-        </w:rPr>
-        <w:t>gabra3</w:t>
-      </w:r>
-      <w:r>
-        <w:t xml:space="preserve">) was downregulated during the male-intermediate transition. This suggests that the intermediate state is characterized by a decrease in sensitivity to both GABA and glutamate </w:t>
-      </w:r>
-      <w:r>
-        <w:t>(</w:t>
-      </w:r>
-      <w:r>
-        <w:rPr>
-          <w:highlight w:val="yellow"/>
-        </w:rPr>
-        <w:t>consistent with the synaptic plasticity that is occurring</w:t>
-      </w:r>
-      <w:r>
-        <w:t>?)</w:t>
-      </w:r>
-      <w:r>
-        <w:t>, and during the intermediate-female transition, glutamate sensitivity returns while GABA receptivity remains suppressed.</w:t>
-      </w:r>
-    </w:p>
-    <w:p>
-      <w:commentRangeStart w:id="15"/>
-      <w:r>
-        <w:tab/>
-        <w:t xml:space="preserve">Further, our DEG analysis detected a switch in voltage-gated potassium channel subtype. During the intermediate-female transition, </w:t>
-      </w:r>
-      <w:r>
-        <w:rPr>
-          <w:i/>
-          <w:iCs/>
-        </w:rPr>
-        <w:t xml:space="preserve">kcnh4-like </w:t>
-      </w:r>
-      <w:r>
-        <w:t>(</w:t>
-      </w:r>
-      <w:r>
-        <w:rPr>
-          <w:i/>
-          <w:iCs/>
-        </w:rPr>
-        <w:t>LOC111566724</w:t>
-      </w:r>
-      <w:r>
-        <w:t xml:space="preserve">) was upregulated, while </w:t>
-      </w:r>
-      <w:r>
-        <w:rPr>
-          <w:i/>
-          <w:iCs/>
-        </w:rPr>
-        <w:t xml:space="preserve">kcnd3-like </w:t>
-      </w:r>
-      <w:r>
-        <w:t>(</w:t>
-      </w:r>
-      <w:r>
-        <w:rPr>
-          <w:i/>
-          <w:iCs/>
-        </w:rPr>
-        <w:t>LOC111576659</w:t>
-      </w:r>
-      <w:r>
-        <w:t xml:space="preserve">) was downregulated. </w:t>
-      </w:r>
-      <w:r>
-        <w:t xml:space="preserve">Given </w:t>
-      </w:r>
-      <w:r>
-        <w:rPr>
-          <w:i/>
-          <w:iCs/>
-        </w:rPr>
-        <w:t>kcnh4</w:t>
-      </w:r>
-      <w:r>
-        <w:t xml:space="preserve"> encodes an Elk subfamily </w:t>
-      </w:r>
-      <w:r>
-        <w:lastRenderedPageBreak/>
-        <w:t xml:space="preserve">potassium channel (Kv12.3), which are characterized by slow opening during hyperpolarization which prevents hyperexcitability and inhibit rapid firing </w:t>
-      </w:r>
-      <w:r>
-        <w:fldChar w:fldCharType="begin"/>
-      </w:r>
-      <w:r>
-        <w:instrText xml:space="preserve"> ADDIN ZOTERO_ITEM CSL_CITATION {"citationID":"PzQ8bTuB","properties":{"formattedCitation":"\\super 18,19\\nosupersub{}","plainCitation":"18,19","noteIndex":0},"citationItems":[{"id":5437,"uris":["http://zotero.org/users/11313215/items/A8F4HTW8"],"itemData":{"id":5437,"type":"article-journal","abstract":"EAG-like (ELK) voltage-gated potassium channels are abundantly expressed in the brain. These channels exhibit a behavior called voltage-dependent potentiation (VDP), which appears to be a specialization to dampen the hyperexitability of neurons. VDP manifests as a potentiation of current amplitude, hyperpolarizing shift in voltage sensitivity, and slowing of deactivation in response to a depolarizing prepulse. Here we show that VDP of D. rerio ELK channels involves the structural interaction between the intracellular N-terminal eag domain and C-terminal CNBHD. Combining transition metal ion FRET, patch-clamp fluorometry, and incorporation of a fluorescent noncanonical amino acid, we show that there is a rearrangement in the eag domain-CNBHD interaction with the kinetics, voltage-dependence, and ATP-dependence of VDP. We propose that the activation of ELK channels involves a slow open-state dependent rearrangement of the direct interaction between the eag domain and CNBHD, which stabilizes the opening of the channel.","container-title":"eLife","DOI":"10.7554/eLife.26355","ISSN":"2050-084X","note":"publisher: eLife Sciences Publications, Ltd","page":"e26355","source":"eLife","title":"Molecular mechanism of voltage-dependent potentiation of KCNH potassium channels","volume":"6","author":[{"family":"Dai","given":"Gucan"},{"family":"Zagotta","given":"William N"}],"editor":[{"family":"Chanda","given":"Baron"}],"issued":{"date-parts":[["2017",4,26]]}}},{"id":5439,"uris":["http://zotero.org/users/11313215/items/NEID8FVD"],"itemData":{"id":5439,"type":"article-journal","abstract":"The Elk subfamily of the Eag K+ channel gene family is represented in mammals by three genes that are highly conserved between humans and rodents. Here we report the distribution and functional properties of a member of the human Elk K+ channel gene family, KCNH8. Quantitative RT-PCR analysis of mRNA expression patterns showed that KCNH8, along with the other Elk family genes, KCNH3 and KCNH4, are primarily expressed in the human nervous system. KCNH8 was expressed at high levels, and the distribution showed substantial overlap with KCNH3. In Xenopus oocytes, KCNH8 gives rise to slowly activating, voltage-dependent K+ currents that open at hyperpolarized potentials (half-maximal activation at -62 mV). Coexpression of KCNH8 with dominant-negative KCNH8, KCNH3, and KCNH4 subunits led to suppression of the KCNH8 currents, suggesting that Elk channels can form heteromultimers. Similar experiments imply that KCNH8 subunits are not able to form heteromultimers with Eag, Erg, or Kv family K+ channels.","container-title":"American Journal of Physiology-Cell Physiology","DOI":"10.1152/ajpcell.00179.2003","ISSN":"0363-6143","issue":"6","note":"publisher: American Physiological Society","page":"C1356-C1366","source":"journals.physiology.org (Atypon)","title":"Distribution and functional properties of human KCNH8 (Elk1) potassium channels","volume":"285","author":[{"family":"Zou","given":"Anruo"},{"family":"Lin","given":"Zhixin"},{"family":"Humble","given":"Margaret"},{"family":"Creech","given":"Christopher D."},{"family":"Wagoner","given":"P. Kay"},{"family":"Krafte","given":"Douglas"},{"family":"Jegla","given":"Timothy J."},{"family":"Wickenden","given":"Alan D."}],"issued":{"date-parts":[["2003",12]]}}}],"schema":"https://github.com/citation-style-language/schema/raw/master/csl-citation.json"} </w:instrText>
-      </w:r>
-      <w:r>
-        <w:fldChar w:fldCharType="separate"/>
-      </w:r>
-      <w:r>
-        <w:rPr>
-          <w:rFonts w:cs="Times New Roman"/>
-          <w:color w:val="000000"/>
-          <w:kern w:val="0"/>
-          <w:szCs w:val="24"/>
-          <w:vertAlign w:val="superscript"/>
-        </w:rPr>
-        <w:t>18,19</w:t>
-      </w:r>
-      <w:r>
-        <w:fldChar w:fldCharType="end"/>
-      </w:r>
-      <w:r>
-        <w:t xml:space="preserve">, upregulation of this channel subtype suggests a decrease in the maximal firing rate of cluster 6 neurons. On the other hand, </w:t>
-      </w:r>
-      <w:r>
-        <w:rPr>
-          <w:i/>
-          <w:iCs/>
-        </w:rPr>
-        <w:t>kcnd3</w:t>
-      </w:r>
-      <w:r>
-        <w:t xml:space="preserve"> encodes Kv4.3 which regulates A-type potassium currents, prolonging action potential duration and increasing spike frequency adaptation. Taken together, these potassium channel changes suggest that during the intermediate-female transition, cluster 6 neurons increase the ability to produce long action potential bursts, a known characteristic of GnRH neurons </w:t>
-      </w:r>
-      <w:commentRangeEnd w:id="15"/>
-      <w:r>
-        <w:rPr>
-          <w:rStyle w:val="CommentReference"/>
-        </w:rPr>
-        <w:commentReference w:id="15"/>
-      </w:r>
-      <w:r>
-        <w:t>(</w:t>
-      </w:r>
-      <w:r>
-        <w:rPr>
-          <w:highlight w:val="yellow"/>
-        </w:rPr>
-        <w:t>CITATION</w:t>
-      </w:r>
-      <w:r>
-        <w:t>)</w:t>
-      </w:r>
-    </w:p>
-    <w:p/>
-    <w:p>
-      <w:pPr>
-        <w:rPr>
-          <w:b/>
-          <w:bCs/>
-        </w:rPr>
-      </w:pPr>
-      <w:r>
-        <w:rPr>
-          <w:b/>
-          <w:bCs/>
-        </w:rPr>
-        <w:t>[Cluster 6] Changes Receptivity to Neuropeptides, Neuromodulators, and Steroid Hormones</w:t>
-      </w:r>
-    </w:p>
-    <w:p>
-      <w:r>
-        <w:rPr>
-          <w:b/>
-          <w:bCs/>
-        </w:rPr>
-        <w:tab/>
-      </w:r>
-      <w:r>
-        <w:t xml:space="preserve">Early in sex change during the male-intermediate transition, we observed a significant downregulation in the </w:t>
-      </w:r>
-      <w:proofErr w:type="spellStart"/>
-      <w:r>
-        <w:t>neuromedin</w:t>
-      </w:r>
-      <w:proofErr w:type="spellEnd"/>
-      <w:r>
-        <w:t xml:space="preserve"> b receptor (</w:t>
-      </w:r>
-      <w:proofErr w:type="spellStart"/>
-      <w:r>
-        <w:rPr>
-          <w:i/>
-          <w:iCs/>
-        </w:rPr>
-        <w:t>nmbr</w:t>
-      </w:r>
-      <w:proofErr w:type="spellEnd"/>
-      <w:r>
-        <w:t>), and the neuropeptide y receptor (</w:t>
-      </w:r>
-      <w:r>
-        <w:rPr>
-          <w:i/>
-          <w:iCs/>
-        </w:rPr>
-        <w:t>npy7r</w:t>
-      </w:r>
-      <w:r>
-        <w:t xml:space="preserve">). </w:t>
-      </w:r>
-      <w:r>
-        <w:t>Further, during the intermediate-female transition, the tachykinin receptor (</w:t>
-      </w:r>
-      <w:r>
-        <w:rPr>
-          <w:i/>
-          <w:iCs/>
-        </w:rPr>
-        <w:t>tacr3a</w:t>
-      </w:r>
-      <w:r>
-        <w:t xml:space="preserve">) was significantly downregulated. Given </w:t>
-      </w:r>
-      <w:proofErr w:type="spellStart"/>
-      <w:r>
-        <w:t>neuromedin</w:t>
-      </w:r>
-      <w:proofErr w:type="spellEnd"/>
-      <w:r>
-        <w:t xml:space="preserve"> b inhibits feeding behavior, while tachykinin and neuropeptide y stimulate feeding, their parallel downregulation is perplexing. </w:t>
-      </w:r>
-    </w:p>
-    <w:p>
-      <w:r>
-        <w:tab/>
-      </w:r>
-      <w:r>
-        <w:t>Surprisingly, during</w:t>
-      </w:r>
-      <w:r>
-        <w:t xml:space="preserve"> the intermediate-female transition, the dopamine receptor </w:t>
-      </w:r>
-      <w:r>
-        <w:rPr>
-          <w:i/>
-          <w:iCs/>
-        </w:rPr>
-        <w:t>drd3</w:t>
-      </w:r>
-      <w:r>
-        <w:t xml:space="preserve"> was also significantly upregulated.</w:t>
-      </w:r>
-      <w:r>
-        <w:t xml:space="preserve"> Dopamine in the POA is largely thought to mediate male sexual behaviors … </w:t>
-      </w:r>
-    </w:p>
-    <w:p/>
-    <w:p>
-      <w:r>
-        <w:t xml:space="preserve">Interestingly in intermediates, the progesterone receptor </w:t>
-      </w:r>
-      <w:proofErr w:type="spellStart"/>
-      <w:r>
-        <w:rPr>
-          <w:i/>
-          <w:iCs/>
-        </w:rPr>
-        <w:t>pgr</w:t>
-      </w:r>
-      <w:proofErr w:type="spellEnd"/>
-      <w:r>
-        <w:t xml:space="preserve"> was significantly downregulated, before a significant upregulation once the transition to female was completed. Further, during the intermediate-female transition, </w:t>
-      </w:r>
-      <w:commentRangeStart w:id="16"/>
-      <w:commentRangeStart w:id="17"/>
-      <w:proofErr w:type="spellStart"/>
-      <w:r>
-        <w:rPr>
-          <w:i/>
-          <w:iCs/>
-        </w:rPr>
-        <w:t>pgr</w:t>
-      </w:r>
-      <w:proofErr w:type="spellEnd"/>
-      <w:r>
-        <w:rPr>
-          <w:i/>
-          <w:iCs/>
-        </w:rPr>
-        <w:t xml:space="preserve">-like </w:t>
-      </w:r>
-      <w:r>
-        <w:t>(</w:t>
-      </w:r>
-      <w:r>
-        <w:rPr>
-          <w:i/>
-          <w:iCs/>
-        </w:rPr>
-        <w:t>LOC111568069</w:t>
-      </w:r>
-      <w:r>
-        <w:t>)</w:t>
-      </w:r>
-      <w:commentRangeEnd w:id="16"/>
-      <w:r>
-        <w:rPr>
-          <w:rStyle w:val="CommentReference"/>
-        </w:rPr>
-        <w:commentReference w:id="16"/>
-      </w:r>
-      <w:commentRangeEnd w:id="17"/>
-      <w:r>
-        <w:rPr>
-          <w:rStyle w:val="CommentReference"/>
-        </w:rPr>
-        <w:commentReference w:id="17"/>
-      </w:r>
-    </w:p>
-    <w:p/>
     <w:p/>
     <w:p/>
     <w:p>
@@ -3690,7 +3964,7 @@
       </w:r>
     </w:p>
   </w:comment>
-  <w:comment w:id="7" w:author="Graham, Gabriel J." w:date="2026-01-20T20:51:00Z" w:initials="GGJ">
+  <w:comment w:id="7" w:author="Graham, Gabriel J." w:date="2026-02-06T10:42:00Z" w:initials="GGJ">
     <w:p>
       <w:r>
         <w:rPr>
@@ -3700,15 +3974,14 @@
       </w:r>
       <w:r>
         <w:rPr>
-          <w:color w:val="000000"/>
           <w:sz w:val="20"/>
           <w:szCs w:val="20"/>
         </w:rPr>
-        <w:t>I think this section can be pared back a lot</w:t>
+        <w:t>should I be using the 2_OL naming convention?</w:t>
       </w:r>
     </w:p>
   </w:comment>
-  <w:comment w:id="10" w:author="Graham, Gabriel J." w:date="2026-02-01T16:05:00Z" w:initials="GGJ">
+  <w:comment w:id="8" w:author="Graham, Gabriel J." w:date="2026-02-06T15:00:00Z" w:initials="GGJ">
     <w:p>
       <w:r>
         <w:rPr>
@@ -3721,11 +3994,11 @@
           <w:sz w:val="20"/>
           <w:szCs w:val="20"/>
         </w:rPr>
-        <w:t>Dbx1 specifies lateral hypothalamus see Dorsky 2017</w:t>
+        <w:t>I think GO might just be too weak, for this kind of analysis</w:t>
       </w:r>
     </w:p>
   </w:comment>
-  <w:comment w:id="8" w:author="Graham, Gabriel J." w:date="2026-01-18T00:17:00Z" w:initials="GGJ">
+  <w:comment w:id="9" w:author="Graham, Gabriel J." w:date="2026-02-06T21:33:00Z" w:initials="GGJ">
     <w:p>
       <w:r>
         <w:rPr>
@@ -3738,11 +4011,11 @@
           <w:sz w:val="20"/>
           <w:szCs w:val="20"/>
         </w:rPr>
-        <w:t>Should maybe include how mutually exclusive they are or the fact that they occur in coexpression modules</w:t>
+        <w:t>But also this needs to be prioritized for the cluster specific sections so for now I think just discuss the different types of DEGs like TFs and neuropeptides maybe</w:t>
       </w:r>
     </w:p>
   </w:comment>
-  <w:comment w:id="9" w:author="Graham, Gabriel J." w:date="2026-01-18T00:43:00Z" w:initials="GGJ">
+  <w:comment w:id="10" w:author="Graham, Gabriel J." w:date="2026-01-25T16:15:00Z" w:initials="GGJ">
     <w:p>
       <w:r>
         <w:rPr>
@@ -3755,11 +4028,11 @@
           <w:sz w:val="20"/>
           <w:szCs w:val="20"/>
         </w:rPr>
-        <w:t>Which TFS are in which cells is very interesting and warrants further analysis?</w:t>
+        <w:t>Needs a lot of wording work but I just needed to get the concept down</w:t>
       </w:r>
     </w:p>
   </w:comment>
-  <w:comment w:id="11" w:author="Graham, Gabriel J." w:date="2026-01-19T19:41:00Z" w:initials="GGJ">
+  <w:comment w:id="11" w:author="Graham, Gabriel J." w:date="2026-02-06T21:11:00Z" w:initials="GGJ">
     <w:p>
       <w:r>
         <w:rPr>
@@ -3772,12 +4045,11 @@
           <w:sz w:val="20"/>
           <w:szCs w:val="20"/>
         </w:rPr>
-        <w:t>its so hard to label these mfs when 1_3 expresses everything</w:t>
-      </w:r>
-    </w:p>
-    <w:p/>
+        <w:t>I think a better way to do this transition without abandoning all of my DEGs is to ask which clusters DEGs are enriched for and if not a single one, then you can say its a cluster wide DEG</w:t>
+      </w:r>
+    </w:p>
   </w:comment>
-  <w:comment w:id="12" w:author="Graham, Gabriel J." w:date="2026-02-01T16:07:00Z" w:initials="GGJ">
+  <w:comment w:id="12" w:author="Graham, Gabriel J." w:date="2026-02-06T21:39:00Z" w:initials="GGJ">
     <w:p>
       <w:r>
         <w:rPr>
@@ -3790,11 +4062,11 @@
           <w:sz w:val="20"/>
           <w:szCs w:val="20"/>
         </w:rPr>
-        <w:t>could be lha or arc look at dorsky 2017</w:t>
+        <w:t>Confirm with neuron</w:t>
       </w:r>
     </w:p>
   </w:comment>
-  <w:comment w:id="13" w:author="Graham, Gabriel J." w:date="2026-01-31T15:19:00Z" w:initials="GGJ">
+  <w:comment w:id="13" w:author="Graham, Gabriel J." w:date="2026-02-06T21:40:00Z" w:initials="GGJ">
     <w:p>
       <w:r>
         <w:rPr>
@@ -3807,11 +4079,11 @@
           <w:sz w:val="20"/>
           <w:szCs w:val="20"/>
         </w:rPr>
-        <w:t>Maybe a better name since they express both cckbrb and gnrh</w:t>
+        <w:t>Probably all wrong</w:t>
       </w:r>
     </w:p>
   </w:comment>
-  <w:comment w:id="14" w:author="Graham, Gabriel J." w:date="2026-01-25T16:15:00Z" w:initials="GGJ">
+  <w:comment w:id="14" w:author="Graham, Gabriel J." w:date="2026-01-26T13:42:00Z" w:initials="GGJ">
     <w:p>
       <w:r>
         <w:rPr>
@@ -3824,11 +4096,11 @@
           <w:sz w:val="20"/>
           <w:szCs w:val="20"/>
         </w:rPr>
-        <w:t>Needs a lot of wording work but I just needed to get the concept down</w:t>
+        <w:t>ok interesting problem here, when you go to the orthodb page, they are all labeled androgen receptor like, which is it?</w:t>
       </w:r>
     </w:p>
   </w:comment>
-  <w:comment w:id="15" w:author="Graham, Gabriel J." w:date="2026-01-26T13:17:00Z" w:initials="GGJ">
+  <w:comment w:id="15" w:author="Graham, Gabriel J." w:date="2026-01-26T13:44:00Z" w:initials="GGJ">
     <w:p>
       <w:r>
         <w:rPr>
@@ -3841,11 +4113,11 @@
           <w:sz w:val="20"/>
           <w:szCs w:val="20"/>
         </w:rPr>
-        <w:t>Needs work, also mention prior that these are in fact the only (or one of the only GnRH + populations in the dataset</w:t>
+        <w:t>It depends on the isoform lmfao what</w:t>
       </w:r>
     </w:p>
   </w:comment>
-  <w:comment w:id="16" w:author="Graham, Gabriel J." w:date="2026-01-26T13:42:00Z" w:initials="GGJ">
+  <w:comment w:id="17" w:author="Graham, Gabriel J." w:date="2026-02-06T20:15:00Z" w:initials="GGJ">
     <w:p>
       <w:r>
         <w:rPr>
@@ -3858,11 +4130,11 @@
           <w:sz w:val="20"/>
           <w:szCs w:val="20"/>
         </w:rPr>
-        <w:t>ok interesting problem here, when you go to the orthodb page, they are all labeled androgen receptor like, which is it?</w:t>
+        <w:t>Sox2 suggests an immature cell type</w:t>
       </w:r>
     </w:p>
   </w:comment>
-  <w:comment w:id="17" w:author="Graham, Gabriel J." w:date="2026-01-26T13:44:00Z" w:initials="GGJ">
+  <w:comment w:id="16" w:author="Graham, Gabriel J." w:date="2026-02-06T20:54:00Z" w:initials="GGJ">
     <w:p>
       <w:r>
         <w:rPr>
@@ -3875,9 +4147,112 @@
           <w:sz w:val="20"/>
           <w:szCs w:val="20"/>
         </w:rPr>
-        <w:t>It depends on the isoform lmfao what</w:t>
-      </w:r>
-    </w:p>
+        <w:t>I am the least confident about the ARC labeling it is very difficult to say for me</w:t>
+      </w:r>
+    </w:p>
+  </w:comment>
+  <w:comment w:id="18" w:author="Graham, Gabriel J." w:date="2026-02-06T21:00:00Z" w:initials="GGJ">
+    <w:p>
+      <w:r>
+        <w:rPr>
+          <w:rStyle w:val="CommentReference"/>
+        </w:rPr>
+        <w:annotationRef/>
+      </w:r>
+      <w:r>
+        <w:rPr>
+          <w:sz w:val="20"/>
+          <w:szCs w:val="20"/>
+        </w:rPr>
+        <w:t>Look at allen institute IEG calculation</w:t>
+      </w:r>
+    </w:p>
+  </w:comment>
+  <w:comment w:id="19" w:author="Graham, Gabriel J." w:date="2026-02-06T21:45:00Z" w:initials="GGJ">
+    <w:p>
+      <w:r>
+        <w:rPr>
+          <w:rStyle w:val="CommentReference"/>
+        </w:rPr>
+        <w:annotationRef/>
+      </w:r>
+      <w:r>
+        <w:rPr>
+          <w:sz w:val="20"/>
+          <w:szCs w:val="20"/>
+        </w:rPr>
+        <w:t>Also redo subcluster IEG analysis but this time instead of doing the mixed beta binomial just take the mean of PC1 and do a linear regression lets relax with all of the mixed model stuff</w:t>
+      </w:r>
+    </w:p>
+  </w:comment>
+  <w:comment w:id="22" w:author="Graham, Gabriel J." w:date="2026-02-01T16:05:00Z" w:initials="GGJ">
+    <w:p>
+      <w:r>
+        <w:rPr>
+          <w:rStyle w:val="CommentReference"/>
+        </w:rPr>
+        <w:annotationRef/>
+      </w:r>
+      <w:r>
+        <w:rPr>
+          <w:sz w:val="20"/>
+          <w:szCs w:val="20"/>
+        </w:rPr>
+        <w:t>Dbx1 specifies lateral hypothalamus see Dorsky 2017</w:t>
+      </w:r>
+    </w:p>
+  </w:comment>
+  <w:comment w:id="20" w:author="Graham, Gabriel J." w:date="2026-01-18T00:17:00Z" w:initials="GGJ">
+    <w:p>
+      <w:r>
+        <w:rPr>
+          <w:rStyle w:val="CommentReference"/>
+        </w:rPr>
+        <w:annotationRef/>
+      </w:r>
+      <w:r>
+        <w:rPr>
+          <w:sz w:val="20"/>
+          <w:szCs w:val="20"/>
+        </w:rPr>
+        <w:t>Should maybe include how mutually exclusive they are or the fact that they occur in coexpression modules</w:t>
+      </w:r>
+    </w:p>
+  </w:comment>
+  <w:comment w:id="21" w:author="Graham, Gabriel J." w:date="2026-01-18T00:43:00Z" w:initials="GGJ">
+    <w:p>
+      <w:r>
+        <w:rPr>
+          <w:rStyle w:val="CommentReference"/>
+        </w:rPr>
+        <w:annotationRef/>
+      </w:r>
+      <w:r>
+        <w:rPr>
+          <w:sz w:val="20"/>
+          <w:szCs w:val="20"/>
+        </w:rPr>
+        <w:t>Which TFS are in which cells is very interesting and warrants further analysis?</w:t>
+      </w:r>
+    </w:p>
+  </w:comment>
+  <w:comment w:id="23" w:author="Graham, Gabriel J." w:date="2026-01-19T19:41:00Z" w:initials="GGJ">
+    <w:p>
+      <w:r>
+        <w:rPr>
+          <w:rStyle w:val="CommentReference"/>
+        </w:rPr>
+        <w:annotationRef/>
+      </w:r>
+      <w:r>
+        <w:rPr>
+          <w:sz w:val="20"/>
+          <w:szCs w:val="20"/>
+        </w:rPr>
+        <w:t>its so hard to label these mfs when 1_3 expresses everything</w:t>
+      </w:r>
+    </w:p>
+    <w:p/>
   </w:comment>
 </w:comments>
 </file>
@@ -3891,17 +4266,23 @@
   <w15:commentEx w15:paraId="1AF44343" w15:done="0"/>
   <w15:commentEx w15:paraId="5F1A36F8" w15:done="0"/>
   <w15:commentEx w15:paraId="0861497F" w15:done="0"/>
-  <w15:commentEx w15:paraId="41E28F78" w15:done="0"/>
+  <w15:commentEx w15:paraId="67900148" w15:done="0"/>
+  <w15:commentEx w15:paraId="60E12BE5" w15:done="0"/>
+  <w15:commentEx w15:paraId="1DF847C5" w15:paraIdParent="60E12BE5" w15:done="0"/>
+  <w15:commentEx w15:paraId="0B571AEA" w15:done="0"/>
+  <w15:commentEx w15:paraId="27B0441F" w15:paraIdParent="0B571AEA" w15:done="0"/>
+  <w15:commentEx w15:paraId="0CD65FC5" w15:done="0"/>
+  <w15:commentEx w15:paraId="326A14B4" w15:done="0"/>
+  <w15:commentEx w15:paraId="0FFC2856" w15:done="0"/>
+  <w15:commentEx w15:paraId="57A430ED" w15:paraIdParent="0FFC2856" w15:done="0"/>
+  <w15:commentEx w15:paraId="13839CF4" w15:done="0"/>
+  <w15:commentEx w15:paraId="30D5116D" w15:done="0"/>
+  <w15:commentEx w15:paraId="7F018A85" w15:done="0"/>
+  <w15:commentEx w15:paraId="5714C2CB" w15:paraIdParent="7F018A85" w15:done="0"/>
   <w15:commentEx w15:paraId="07892E08" w15:done="0"/>
   <w15:commentEx w15:paraId="2CA32D90" w15:done="0"/>
   <w15:commentEx w15:paraId="69C4FC3B" w15:paraIdParent="2CA32D90" w15:done="0"/>
   <w15:commentEx w15:paraId="3FCCEA76" w15:done="0"/>
-  <w15:commentEx w15:paraId="283523A4" w15:done="0"/>
-  <w15:commentEx w15:paraId="4EBBD6BE" w15:done="0"/>
-  <w15:commentEx w15:paraId="13103B94" w15:done="0"/>
-  <w15:commentEx w15:paraId="48E69DBC" w15:done="0"/>
-  <w15:commentEx w15:paraId="0FBDCB30" w15:done="0"/>
-  <w15:commentEx w15:paraId="7A6A0BC0" w15:paraIdParent="0FBDCB30" w15:done="0"/>
 </w15:commentsEx>
 </file>
 
@@ -3914,17 +4295,23 @@
   <w16cex:commentExtensible w16cex:durableId="3470318A" w16cex:dateUtc="2026-01-17T21:58:00Z"/>
   <w16cex:commentExtensible w16cex:durableId="63A07A59" w16cex:dateUtc="2026-02-01T20:41:00Z"/>
   <w16cex:commentExtensible w16cex:durableId="7701F384" w16cex:dateUtc="2026-01-18T03:33:00Z"/>
-  <w16cex:commentExtensible w16cex:durableId="31F1FEA9" w16cex:dateUtc="2026-01-21T01:51:00Z"/>
+  <w16cex:commentExtensible w16cex:durableId="7696B529" w16cex:dateUtc="2026-02-06T15:42:00Z"/>
+  <w16cex:commentExtensible w16cex:durableId="04676AE4" w16cex:dateUtc="2026-02-06T20:00:00Z"/>
+  <w16cex:commentExtensible w16cex:durableId="266DA932" w16cex:dateUtc="2026-02-07T02:33:00Z"/>
+  <w16cex:commentExtensible w16cex:durableId="3A198B7A" w16cex:dateUtc="2026-01-25T21:15:00Z"/>
+  <w16cex:commentExtensible w16cex:durableId="3F27D270" w16cex:dateUtc="2026-02-07T02:11:00Z"/>
+  <w16cex:commentExtensible w16cex:durableId="0740AA69" w16cex:dateUtc="2026-02-07T02:39:00Z"/>
+  <w16cex:commentExtensible w16cex:durableId="49961A6A" w16cex:dateUtc="2026-02-07T02:40:00Z"/>
+  <w16cex:commentExtensible w16cex:durableId="7EC70204" w16cex:dateUtc="2026-01-26T18:42:00Z"/>
+  <w16cex:commentExtensible w16cex:durableId="222A83CD" w16cex:dateUtc="2026-01-26T18:44:00Z"/>
+  <w16cex:commentExtensible w16cex:durableId="212741B5" w16cex:dateUtc="2026-02-07T01:15:00Z"/>
+  <w16cex:commentExtensible w16cex:durableId="26B0D063" w16cex:dateUtc="2026-02-07T01:54:00Z"/>
+  <w16cex:commentExtensible w16cex:durableId="7364F9C8" w16cex:dateUtc="2026-02-07T02:00:00Z"/>
+  <w16cex:commentExtensible w16cex:durableId="2F5D6B8A" w16cex:dateUtc="2026-02-07T02:45:00Z"/>
   <w16cex:commentExtensible w16cex:durableId="3826AD3D" w16cex:dateUtc="2026-02-01T21:05:00Z"/>
   <w16cex:commentExtensible w16cex:durableId="38F20FE7" w16cex:dateUtc="2026-01-18T05:17:00Z"/>
   <w16cex:commentExtensible w16cex:durableId="3282ED63" w16cex:dateUtc="2026-01-18T05:43:00Z"/>
   <w16cex:commentExtensible w16cex:durableId="6639CEDD" w16cex:dateUtc="2026-01-20T00:41:00Z"/>
-  <w16cex:commentExtensible w16cex:durableId="72D24938" w16cex:dateUtc="2026-02-01T21:07:00Z"/>
-  <w16cex:commentExtensible w16cex:durableId="5FB95C5E" w16cex:dateUtc="2026-01-31T20:19:00Z"/>
-  <w16cex:commentExtensible w16cex:durableId="3A198B7A" w16cex:dateUtc="2026-01-25T21:15:00Z"/>
-  <w16cex:commentExtensible w16cex:durableId="7F9A663E" w16cex:dateUtc="2026-01-26T18:17:00Z"/>
-  <w16cex:commentExtensible w16cex:durableId="7EC70204" w16cex:dateUtc="2026-01-26T18:42:00Z"/>
-  <w16cex:commentExtensible w16cex:durableId="222A83CD" w16cex:dateUtc="2026-01-26T18:44:00Z"/>
 </w16cex:commentsExtensible>
 </file>
 
@@ -3937,17 +4324,23 @@
   <w16cid:commentId w16cid:paraId="1AF44343" w16cid:durableId="3470318A"/>
   <w16cid:commentId w16cid:paraId="5F1A36F8" w16cid:durableId="63A07A59"/>
   <w16cid:commentId w16cid:paraId="0861497F" w16cid:durableId="7701F384"/>
-  <w16cid:commentId w16cid:paraId="41E28F78" w16cid:durableId="31F1FEA9"/>
+  <w16cid:commentId w16cid:paraId="67900148" w16cid:durableId="7696B529"/>
+  <w16cid:commentId w16cid:paraId="60E12BE5" w16cid:durableId="04676AE4"/>
+  <w16cid:commentId w16cid:paraId="1DF847C5" w16cid:durableId="266DA932"/>
+  <w16cid:commentId w16cid:paraId="0B571AEA" w16cid:durableId="3A198B7A"/>
+  <w16cid:commentId w16cid:paraId="27B0441F" w16cid:durableId="3F27D270"/>
+  <w16cid:commentId w16cid:paraId="0CD65FC5" w16cid:durableId="0740AA69"/>
+  <w16cid:commentId w16cid:paraId="326A14B4" w16cid:durableId="49961A6A"/>
+  <w16cid:commentId w16cid:paraId="0FFC2856" w16cid:durableId="7EC70204"/>
+  <w16cid:commentId w16cid:paraId="57A430ED" w16cid:durableId="222A83CD"/>
+  <w16cid:commentId w16cid:paraId="13839CF4" w16cid:durableId="212741B5"/>
+  <w16cid:commentId w16cid:paraId="30D5116D" w16cid:durableId="26B0D063"/>
+  <w16cid:commentId w16cid:paraId="7F018A85" w16cid:durableId="7364F9C8"/>
+  <w16cid:commentId w16cid:paraId="5714C2CB" w16cid:durableId="2F5D6B8A"/>
   <w16cid:commentId w16cid:paraId="07892E08" w16cid:durableId="3826AD3D"/>
   <w16cid:commentId w16cid:paraId="2CA32D90" w16cid:durableId="38F20FE7"/>
   <w16cid:commentId w16cid:paraId="69C4FC3B" w16cid:durableId="3282ED63"/>
   <w16cid:commentId w16cid:paraId="3FCCEA76" w16cid:durableId="6639CEDD"/>
-  <w16cid:commentId w16cid:paraId="283523A4" w16cid:durableId="72D24938"/>
-  <w16cid:commentId w16cid:paraId="4EBBD6BE" w16cid:durableId="5FB95C5E"/>
-  <w16cid:commentId w16cid:paraId="13103B94" w16cid:durableId="3A198B7A"/>
-  <w16cid:commentId w16cid:paraId="48E69DBC" w16cid:durableId="7F9A663E"/>
-  <w16cid:commentId w16cid:paraId="0FBDCB30" w16cid:durableId="7EC70204"/>
-  <w16cid:commentId w16cid:paraId="7A6A0BC0" w16cid:durableId="222A83CD"/>
 </w16cid:commentsIds>
 </file>
 

</xml_diff>